<commit_message>
physics/verlet.py'ye wind/wind_scale eklendi (gravity gibi her karede uygulanan, nokta başına ölçeklenen dış ivme): omuzdan sarkan, hiçbir hedefe bağlı olmayan/hiçbir açı kısıtlaması almayan 8 segmentlik saf bir pelerin. İlk 3sn rüzgarsız (sadece karakterin kendi hareketiyle sallanıyor), sonra 1.5sn'de düzensiz (3 farklı frekansın toplamı) bir gust rüzgarına geçiyor.
</commit_message>
<xml_diff>
--- a/Möbius.docx
+++ b/Möbius.docx
@@ -599,21 +599,7 @@
         <w:rPr>
           <w:lang w:val="tr-TR"/>
         </w:rPr>
-        <w:t xml:space="preserve"> hareketini saf </w:t>
-      </w:r>
-      <w:proofErr w:type="gramStart"/>
-      <w:r>
-        <w:rPr>
-          <w:lang w:val="tr-TR"/>
-        </w:rPr>
-        <w:t>sin(</w:t>
-      </w:r>
-      <w:proofErr w:type="gramEnd"/>
-      <w:r>
-        <w:rPr>
-          <w:lang w:val="tr-TR"/>
-        </w:rPr>
-        <w:t xml:space="preserve">) formülüyle döndürülen "robotik" bir zincirle yan yana karşılaştırdık (verlet_vs_robotic.mp4, kullanıcıya teslim edildi). </w:t>
+        <w:t xml:space="preserve"> hareketini saf sin() formülüyle döndürülen "robotik" bir zincirle yan yana karşılaştırdık (verlet_vs_robotic.mp4, kullanıcıya teslim edildi). </w:t>
       </w:r>
       <w:proofErr w:type="spellStart"/>
       <w:r>
@@ -793,14 +779,979 @@
           <w:bCs/>
           <w:lang w:val="tr-TR"/>
         </w:rPr>
-        <w:t>İş bölümü (öneri)</w:t>
+        <w:t xml:space="preserve">Kod durumu </w:t>
+      </w:r>
+    </w:p>
+    <w:p>
+      <w:pPr>
+        <w:rPr>
+          <w:lang w:val="tr-TR"/>
+        </w:rPr>
+      </w:pPr>
+      <w:proofErr w:type="spellStart"/>
+      <w:r>
+        <w:rPr>
+          <w:lang w:val="tr-TR"/>
+        </w:rPr>
+        <w:t>mobius</w:t>
+      </w:r>
+      <w:proofErr w:type="spellEnd"/>
+      <w:r>
+        <w:rPr>
+          <w:lang w:val="tr-TR"/>
+        </w:rPr>
+        <w:t>/</w:t>
+      </w:r>
+    </w:p>
+    <w:p>
+      <w:pPr>
+        <w:rPr>
+          <w:lang w:val="tr-TR"/>
+        </w:rPr>
+      </w:pPr>
+      <w:r>
+        <w:rPr>
+          <w:lang w:val="tr-TR"/>
+        </w:rPr>
+        <w:t xml:space="preserve">  README.md                       &lt;- kurulum, kullanım, üçüncü taraf lisans </w:t>
+      </w:r>
+      <w:proofErr w:type="spellStart"/>
+      <w:r>
+        <w:rPr>
+          <w:lang w:val="tr-TR"/>
+        </w:rPr>
+        <w:t>attribution</w:t>
+      </w:r>
+      <w:proofErr w:type="spellEnd"/>
+      <w:r>
+        <w:rPr>
+          <w:lang w:val="tr-TR"/>
+        </w:rPr>
+        <w:t>, tasarım notları</w:t>
+      </w:r>
+    </w:p>
+    <w:p>
+      <w:pPr>
+        <w:rPr>
+          <w:lang w:val="tr-TR"/>
+        </w:rPr>
+      </w:pPr>
+      <w:r>
+        <w:rPr>
+          <w:lang w:val="tr-TR"/>
+        </w:rPr>
+        <w:lastRenderedPageBreak/>
+        <w:t xml:space="preserve">  physics/verlet.py               &lt;- </w:t>
+      </w:r>
+      <w:proofErr w:type="spellStart"/>
+      <w:r>
+        <w:rPr>
+          <w:lang w:val="tr-TR"/>
+        </w:rPr>
+        <w:t>VerletSystem</w:t>
+      </w:r>
+      <w:proofErr w:type="spellEnd"/>
+      <w:r>
+        <w:rPr>
+          <w:lang w:val="tr-TR"/>
+        </w:rPr>
+        <w:t xml:space="preserve"> + </w:t>
+      </w:r>
+      <w:proofErr w:type="spellStart"/>
+      <w:r>
+        <w:rPr>
+          <w:lang w:val="tr-TR"/>
+        </w:rPr>
+        <w:t>clamp_direction</w:t>
+      </w:r>
+      <w:proofErr w:type="spellEnd"/>
+      <w:r>
+        <w:rPr>
+          <w:lang w:val="tr-TR"/>
+        </w:rPr>
+        <w:t xml:space="preserve"> (gövde/boyun stabilizasyonu, </w:t>
+      </w:r>
+      <w:proofErr w:type="spellStart"/>
+      <w:r>
+        <w:rPr>
+          <w:lang w:val="tr-TR"/>
+        </w:rPr>
+        <w:t>pinned</w:t>
+      </w:r>
+      <w:proofErr w:type="spellEnd"/>
+      <w:r>
+        <w:rPr>
+          <w:lang w:val="tr-TR"/>
+        </w:rPr>
+        <w:t xml:space="preserve"> nokta </w:t>
+      </w:r>
+      <w:proofErr w:type="spellStart"/>
+      <w:r>
+        <w:rPr>
+          <w:lang w:val="tr-TR"/>
+        </w:rPr>
+        <w:t>jitter</w:t>
+      </w:r>
+      <w:proofErr w:type="spellEnd"/>
+      <w:r>
+        <w:rPr>
+          <w:lang w:val="tr-TR"/>
+        </w:rPr>
+        <w:t xml:space="preserve"> </w:t>
+      </w:r>
+      <w:proofErr w:type="spellStart"/>
+      <w:r>
+        <w:rPr>
+          <w:lang w:val="tr-TR"/>
+        </w:rPr>
+        <w:t>fix</w:t>
+      </w:r>
+      <w:proofErr w:type="spellEnd"/>
+      <w:r>
+        <w:rPr>
+          <w:lang w:val="tr-TR"/>
+        </w:rPr>
+        <w:t xml:space="preserve">, </w:t>
+      </w:r>
+      <w:proofErr w:type="spellStart"/>
+      <w:r>
+        <w:rPr>
+          <w:lang w:val="tr-TR"/>
+        </w:rPr>
+        <w:t>wind</w:t>
+      </w:r>
+      <w:proofErr w:type="spellEnd"/>
+      <w:r>
+        <w:rPr>
+          <w:lang w:val="tr-TR"/>
+        </w:rPr>
+        <w:t>/</w:t>
+      </w:r>
+      <w:proofErr w:type="spellStart"/>
+      <w:r>
+        <w:rPr>
+          <w:lang w:val="tr-TR"/>
+        </w:rPr>
+        <w:t>wind_scale</w:t>
+      </w:r>
+      <w:proofErr w:type="spellEnd"/>
+      <w:r>
+        <w:rPr>
+          <w:lang w:val="tr-TR"/>
+        </w:rPr>
+        <w:t>)</w:t>
+      </w:r>
+    </w:p>
+    <w:p>
+      <w:pPr>
+        <w:rPr>
+          <w:lang w:val="tr-TR"/>
+        </w:rPr>
+      </w:pPr>
+      <w:r>
+        <w:rPr>
+          <w:lang w:val="tr-TR"/>
+        </w:rPr>
+        <w:t xml:space="preserve">  physics/fabrik.py               &lt;- FabrikChain2D + </w:t>
+      </w:r>
+      <w:proofErr w:type="spellStart"/>
+      <w:r>
+        <w:rPr>
+          <w:lang w:val="tr-TR"/>
+        </w:rPr>
+        <w:t>clamp_joint_angles</w:t>
+      </w:r>
+      <w:proofErr w:type="spellEnd"/>
+      <w:r>
+        <w:rPr>
+          <w:lang w:val="tr-TR"/>
+        </w:rPr>
+        <w:t xml:space="preserve"> (diz açı sınırı)</w:t>
+      </w:r>
+    </w:p>
+    <w:p>
+      <w:pPr>
+        <w:rPr>
+          <w:lang w:val="tr-TR"/>
+        </w:rPr>
+      </w:pPr>
+      <w:r>
+        <w:rPr>
+          <w:lang w:val="tr-TR"/>
+        </w:rPr>
+        <w:t xml:space="preserve">  physics/gait.py                 &lt;- </w:t>
+      </w:r>
+      <w:proofErr w:type="spellStart"/>
+      <w:r>
+        <w:rPr>
+          <w:lang w:val="tr-TR"/>
+        </w:rPr>
+        <w:t>FootPlantingLeg</w:t>
+      </w:r>
+      <w:proofErr w:type="spellEnd"/>
+      <w:r>
+        <w:rPr>
+          <w:lang w:val="tr-TR"/>
+        </w:rPr>
+        <w:t xml:space="preserve"> (</w:t>
+      </w:r>
+      <w:proofErr w:type="spellStart"/>
+      <w:r>
+        <w:rPr>
+          <w:lang w:val="tr-TR"/>
+        </w:rPr>
+        <w:t>foot-planting</w:t>
+      </w:r>
+      <w:proofErr w:type="spellEnd"/>
+      <w:r>
+        <w:rPr>
+          <w:lang w:val="tr-TR"/>
+        </w:rPr>
+        <w:t xml:space="preserve"> </w:t>
+      </w:r>
+      <w:proofErr w:type="spellStart"/>
+      <w:r>
+        <w:rPr>
+          <w:lang w:val="tr-TR"/>
+        </w:rPr>
+        <w:t>state</w:t>
+      </w:r>
+      <w:proofErr w:type="spellEnd"/>
+      <w:r>
+        <w:rPr>
+          <w:lang w:val="tr-TR"/>
+        </w:rPr>
+        <w:t xml:space="preserve"> </w:t>
+      </w:r>
+      <w:proofErr w:type="spellStart"/>
+      <w:r>
+        <w:rPr>
+          <w:lang w:val="tr-TR"/>
+        </w:rPr>
+        <w:t>machine</w:t>
+      </w:r>
+      <w:proofErr w:type="spellEnd"/>
+      <w:r>
+        <w:rPr>
+          <w:lang w:val="tr-TR"/>
+        </w:rPr>
+        <w:t xml:space="preserve">, sıfırdan yazıldı; </w:t>
+      </w:r>
+      <w:proofErr w:type="spellStart"/>
+      <w:r>
+        <w:rPr>
+          <w:lang w:val="tr-TR"/>
+        </w:rPr>
+        <w:t>ease</w:t>
+      </w:r>
+      <w:proofErr w:type="spellEnd"/>
+      <w:r>
+        <w:rPr>
+          <w:lang w:val="tr-TR"/>
+        </w:rPr>
+        <w:t>-in/</w:t>
+      </w:r>
+      <w:proofErr w:type="spellStart"/>
+      <w:r>
+        <w:rPr>
+          <w:lang w:val="tr-TR"/>
+        </w:rPr>
+        <w:t>out</w:t>
+      </w:r>
+      <w:proofErr w:type="spellEnd"/>
+      <w:r>
+        <w:rPr>
+          <w:lang w:val="tr-TR"/>
+        </w:rPr>
+        <w:t xml:space="preserve"> </w:t>
+      </w:r>
+      <w:proofErr w:type="spellStart"/>
+      <w:r>
+        <w:rPr>
+          <w:lang w:val="tr-TR"/>
+        </w:rPr>
+        <w:t>swing</w:t>
+      </w:r>
+      <w:proofErr w:type="spellEnd"/>
+      <w:r>
+        <w:rPr>
+          <w:lang w:val="tr-TR"/>
+        </w:rPr>
+        <w:t>)</w:t>
+      </w:r>
+    </w:p>
+    <w:p>
+      <w:pPr>
+        <w:rPr>
+          <w:lang w:val="tr-TR"/>
+        </w:rPr>
+      </w:pPr>
+      <w:r>
+        <w:rPr>
+          <w:lang w:val="tr-TR"/>
+        </w:rPr>
+        <w:t xml:space="preserve">  demo/step1_verlet_chain.py      &lt;- Adım 1</w:t>
+      </w:r>
+    </w:p>
+    <w:p>
+      <w:pPr>
+        <w:rPr>
+          <w:lang w:val="tr-TR"/>
+        </w:rPr>
+      </w:pPr>
+      <w:r>
+        <w:rPr>
+          <w:lang w:val="tr-TR"/>
+        </w:rPr>
+        <w:t xml:space="preserve">  demo/step2_leg_reach.py         &lt;- Adım 2 (physics/gait.py kullanıyor)</w:t>
+      </w:r>
+    </w:p>
+    <w:p>
+      <w:pPr>
+        <w:rPr>
+          <w:lang w:val="tr-TR"/>
+        </w:rPr>
+      </w:pPr>
+      <w:r>
+        <w:rPr>
+          <w:lang w:val="tr-TR"/>
+        </w:rPr>
+        <w:t xml:space="preserve">  demo/step3_full_skeleton.py     &lt;- Adım 3</w:t>
+      </w:r>
+    </w:p>
+    <w:p>
+      <w:pPr>
+        <w:rPr>
+          <w:lang w:val="tr-TR"/>
+        </w:rPr>
+      </w:pPr>
+      <w:r>
+        <w:rPr>
+          <w:lang w:val="tr-TR"/>
+        </w:rPr>
+        <w:t xml:space="preserve">  demo/step4_gait_tuning.py       &lt;- Adım 4</w:t>
+      </w:r>
+    </w:p>
+    <w:p>
+      <w:pPr>
+        <w:rPr>
+          <w:lang w:val="tr-TR"/>
+        </w:rPr>
+      </w:pPr>
+      <w:r>
+        <w:rPr>
+          <w:lang w:val="tr-TR"/>
+        </w:rPr>
+        <w:t xml:space="preserve">  demo/step5_parallax.py          &lt;- Adım 5</w:t>
+      </w:r>
+    </w:p>
+    <w:p>
+      <w:pPr>
+        <w:rPr>
+          <w:lang w:val="tr-TR"/>
+        </w:rPr>
+      </w:pPr>
+      <w:r>
+        <w:rPr>
+          <w:lang w:val="tr-TR"/>
+        </w:rPr>
+        <w:t xml:space="preserve">  demo/step10_secondary_wind.py   &lt;- Adım 10 (başlangıç): pelerin + rüzgar</w:t>
+      </w:r>
+    </w:p>
+    <w:p>
+      <w:pPr>
+        <w:rPr>
+          <w:lang w:val="tr-TR"/>
+        </w:rPr>
+      </w:pPr>
+      <w:r>
+        <w:rPr>
+          <w:lang w:val="tr-TR"/>
+        </w:rPr>
+        <w:t xml:space="preserve">  </w:t>
+      </w:r>
+      <w:proofErr w:type="spellStart"/>
+      <w:r>
+        <w:rPr>
+          <w:lang w:val="tr-TR"/>
+        </w:rPr>
+        <w:t>third_party_licenses</w:t>
+      </w:r>
+      <w:proofErr w:type="spellEnd"/>
+      <w:r>
+        <w:rPr>
+          <w:lang w:val="tr-TR"/>
+        </w:rPr>
+        <w:t>/           &lt;- Apache-2.0 ve MIT lisans metinleri (orijinal, değiştirilmemiş)</w:t>
+      </w:r>
+    </w:p>
+    <w:p>
+      <w:pPr>
+        <w:rPr>
+          <w:lang w:val="tr-TR"/>
+        </w:rPr>
+      </w:pPr>
+      <w:r>
+        <w:rPr>
+          <w:lang w:val="tr-TR"/>
+        </w:rPr>
+        <w:t xml:space="preserve">  </w:t>
+      </w:r>
+      <w:proofErr w:type="spellStart"/>
+      <w:r>
+        <w:rPr>
+          <w:lang w:val="tr-TR"/>
+        </w:rPr>
+        <w:t>outputs</w:t>
+      </w:r>
+      <w:proofErr w:type="spellEnd"/>
+      <w:r>
+        <w:rPr>
+          <w:lang w:val="tr-TR"/>
+        </w:rPr>
+        <w:t xml:space="preserve">/*.mp4                   &lt;- </w:t>
+      </w:r>
+      <w:proofErr w:type="spellStart"/>
+      <w:r>
+        <w:rPr>
+          <w:lang w:val="tr-TR"/>
+        </w:rPr>
+        <w:t>render</w:t>
+      </w:r>
+      <w:proofErr w:type="spellEnd"/>
+      <w:r>
+        <w:rPr>
+          <w:lang w:val="tr-TR"/>
+        </w:rPr>
+        <w:t xml:space="preserve"> edilen demo videoları (</w:t>
+      </w:r>
+      <w:proofErr w:type="spellStart"/>
+      <w:r>
+        <w:rPr>
+          <w:lang w:val="tr-TR"/>
+        </w:rPr>
+        <w:t>git'e</w:t>
+      </w:r>
+      <w:proofErr w:type="spellEnd"/>
+      <w:r>
+        <w:rPr>
+          <w:lang w:val="tr-TR"/>
+        </w:rPr>
+        <w:t xml:space="preserve"> girmiyor, klasörde duruyor)</w:t>
+      </w:r>
+    </w:p>
+    <w:p>
+      <w:pPr>
+        <w:rPr>
+          <w:b/>
+          <w:bCs/>
+          <w:lang w:val="tr-TR"/>
+        </w:rPr>
+      </w:pPr>
+      <w:r>
+        <w:rPr>
+          <w:b/>
+          <w:bCs/>
+          <w:lang w:val="tr-TR"/>
+        </w:rPr>
+        <w:t>Açık kaynak kod incelemesi — telif/lisans sonucu</w:t>
+      </w:r>
+    </w:p>
+    <w:tbl>
+      <w:tblPr>
+        <w:tblW w:w="0" w:type="auto"/>
+        <w:tblCellSpacing w:w="15" w:type="dxa"/>
+        <w:tblCellMar>
+          <w:top w:w="15" w:type="dxa"/>
+          <w:left w:w="15" w:type="dxa"/>
+          <w:bottom w:w="15" w:type="dxa"/>
+          <w:right w:w="15" w:type="dxa"/>
+        </w:tblCellMar>
+        <w:tblLook w:val="04A0" w:firstRow="1" w:lastRow="0" w:firstColumn="1" w:lastColumn="0" w:noHBand="0" w:noVBand="1"/>
+      </w:tblPr>
+      <w:tblGrid>
+        <w:gridCol w:w="3541"/>
+        <w:gridCol w:w="2423"/>
+        <w:gridCol w:w="2889"/>
+      </w:tblGrid>
+      <w:tr>
+        <w:trPr>
+          <w:tblHeader/>
+          <w:tblCellSpacing w:w="15" w:type="dxa"/>
+        </w:trPr>
+        <w:tc>
+          <w:tcPr>
+            <w:tcW w:w="0" w:type="auto"/>
+            <w:vAlign w:val="center"/>
+            <w:hideMark/>
+          </w:tcPr>
+          <w:p>
+            <w:pPr>
+              <w:rPr>
+                <w:b/>
+                <w:bCs/>
+                <w:lang w:val="tr-TR"/>
+              </w:rPr>
+            </w:pPr>
+            <w:r>
+              <w:rPr>
+                <w:b/>
+                <w:bCs/>
+                <w:lang w:val="tr-TR"/>
+              </w:rPr>
+              <w:t>Repo</w:t>
+            </w:r>
+          </w:p>
+        </w:tc>
+        <w:tc>
+          <w:tcPr>
+            <w:tcW w:w="0" w:type="auto"/>
+            <w:vAlign w:val="center"/>
+            <w:hideMark/>
+          </w:tcPr>
+          <w:p>
+            <w:pPr>
+              <w:rPr>
+                <w:b/>
+                <w:bCs/>
+                <w:lang w:val="tr-TR"/>
+              </w:rPr>
+            </w:pPr>
+            <w:r>
+              <w:rPr>
+                <w:b/>
+                <w:bCs/>
+                <w:lang w:val="tr-TR"/>
+              </w:rPr>
+              <w:t>Lisans</w:t>
+            </w:r>
+          </w:p>
+        </w:tc>
+        <w:tc>
+          <w:tcPr>
+            <w:tcW w:w="0" w:type="auto"/>
+            <w:vAlign w:val="center"/>
+            <w:hideMark/>
+          </w:tcPr>
+          <w:p>
+            <w:pPr>
+              <w:rPr>
+                <w:b/>
+                <w:bCs/>
+                <w:lang w:val="tr-TR"/>
+              </w:rPr>
+            </w:pPr>
+            <w:r>
+              <w:rPr>
+                <w:b/>
+                <w:bCs/>
+                <w:lang w:val="tr-TR"/>
+              </w:rPr>
+              <w:t>Karar</w:t>
+            </w:r>
+          </w:p>
+        </w:tc>
+      </w:tr>
+      <w:tr>
+        <w:trPr>
+          <w:tblCellSpacing w:w="15" w:type="dxa"/>
+        </w:trPr>
+        <w:tc>
+          <w:tcPr>
+            <w:tcW w:w="0" w:type="auto"/>
+            <w:vAlign w:val="center"/>
+            <w:hideMark/>
+          </w:tcPr>
+          <w:p>
+            <w:pPr>
+              <w:rPr>
+                <w:lang w:val="tr-TR"/>
+              </w:rPr>
+            </w:pPr>
+            <w:hyperlink r:id="rId5" w:history="1">
+              <w:proofErr w:type="spellStart"/>
+              <w:r>
+                <w:rPr>
+                  <w:rStyle w:val="Kpr"/>
+                  <w:lang w:val="tr-TR"/>
+                </w:rPr>
+                <w:t>austinweis</w:t>
+              </w:r>
+              <w:proofErr w:type="spellEnd"/>
+              <w:r>
+                <w:rPr>
+                  <w:rStyle w:val="Kpr"/>
+                  <w:lang w:val="tr-TR"/>
+                </w:rPr>
+                <w:t>/</w:t>
+              </w:r>
+              <w:proofErr w:type="spellStart"/>
+              <w:r>
+                <w:rPr>
+                  <w:rStyle w:val="Kpr"/>
+                  <w:lang w:val="tr-TR"/>
+                </w:rPr>
+                <w:t>python-verlet-integration</w:t>
+              </w:r>
+              <w:proofErr w:type="spellEnd"/>
+            </w:hyperlink>
+          </w:p>
+        </w:tc>
+        <w:tc>
+          <w:tcPr>
+            <w:tcW w:w="0" w:type="auto"/>
+            <w:vAlign w:val="center"/>
+            <w:hideMark/>
+          </w:tcPr>
+          <w:p>
+            <w:pPr>
+              <w:rPr>
+                <w:lang w:val="tr-TR"/>
+              </w:rPr>
+            </w:pPr>
+            <w:r>
+              <w:rPr>
+                <w:lang w:val="tr-TR"/>
+              </w:rPr>
+              <w:t>Apache-2.0</w:t>
+            </w:r>
+          </w:p>
+        </w:tc>
+        <w:tc>
+          <w:tcPr>
+            <w:tcW w:w="0" w:type="auto"/>
+            <w:vAlign w:val="center"/>
+            <w:hideMark/>
+          </w:tcPr>
+          <w:p>
+            <w:pPr>
+              <w:rPr>
+                <w:lang w:val="tr-TR"/>
+              </w:rPr>
+            </w:pPr>
+            <w:r>
+              <w:rPr>
+                <w:b/>
+                <w:bCs/>
+                <w:lang w:val="tr-TR"/>
+              </w:rPr>
+              <w:t>Uyarlandı</w:t>
+            </w:r>
+            <w:r>
+              <w:rPr>
+                <w:lang w:val="tr-TR"/>
+              </w:rPr>
+              <w:t xml:space="preserve"> → physics/verlet.py</w:t>
+            </w:r>
+          </w:p>
+        </w:tc>
+      </w:tr>
+      <w:tr>
+        <w:trPr>
+          <w:tblCellSpacing w:w="15" w:type="dxa"/>
+        </w:trPr>
+        <w:tc>
+          <w:tcPr>
+            <w:tcW w:w="0" w:type="auto"/>
+            <w:vAlign w:val="center"/>
+            <w:hideMark/>
+          </w:tcPr>
+          <w:p>
+            <w:pPr>
+              <w:rPr>
+                <w:lang w:val="tr-TR"/>
+              </w:rPr>
+            </w:pPr>
+            <w:hyperlink r:id="rId6" w:history="1">
+              <w:proofErr w:type="spellStart"/>
+              <w:r>
+                <w:rPr>
+                  <w:rStyle w:val="Kpr"/>
+                  <w:lang w:val="tr-TR"/>
+                </w:rPr>
+                <w:t>Yanneeh</w:t>
+              </w:r>
+              <w:proofErr w:type="spellEnd"/>
+              <w:r>
+                <w:rPr>
+                  <w:rStyle w:val="Kpr"/>
+                  <w:lang w:val="tr-TR"/>
+                </w:rPr>
+                <w:t>/</w:t>
+              </w:r>
+              <w:proofErr w:type="spellStart"/>
+              <w:r>
+                <w:rPr>
+                  <w:rStyle w:val="Kpr"/>
+                  <w:lang w:val="tr-TR"/>
+                </w:rPr>
+                <w:t>Fabrik-Inverse-kinematics</w:t>
+              </w:r>
+              <w:proofErr w:type="spellEnd"/>
+            </w:hyperlink>
+          </w:p>
+        </w:tc>
+        <w:tc>
+          <w:tcPr>
+            <w:tcW w:w="0" w:type="auto"/>
+            <w:vAlign w:val="center"/>
+            <w:hideMark/>
+          </w:tcPr>
+          <w:p>
+            <w:pPr>
+              <w:rPr>
+                <w:lang w:val="tr-TR"/>
+              </w:rPr>
+            </w:pPr>
+            <w:r>
+              <w:rPr>
+                <w:lang w:val="tr-TR"/>
+              </w:rPr>
+              <w:t>MIT</w:t>
+            </w:r>
+          </w:p>
+        </w:tc>
+        <w:tc>
+          <w:tcPr>
+            <w:tcW w:w="0" w:type="auto"/>
+            <w:vAlign w:val="center"/>
+            <w:hideMark/>
+          </w:tcPr>
+          <w:p>
+            <w:pPr>
+              <w:rPr>
+                <w:lang w:val="tr-TR"/>
+              </w:rPr>
+            </w:pPr>
+            <w:r>
+              <w:rPr>
+                <w:b/>
+                <w:bCs/>
+                <w:lang w:val="tr-TR"/>
+              </w:rPr>
+              <w:t>Uyarlandı</w:t>
+            </w:r>
+            <w:r>
+              <w:rPr>
+                <w:lang w:val="tr-TR"/>
+              </w:rPr>
+              <w:t xml:space="preserve"> → physics/fabrik.py</w:t>
+            </w:r>
+          </w:p>
+        </w:tc>
+      </w:tr>
+      <w:tr>
+        <w:trPr>
+          <w:tblCellSpacing w:w="15" w:type="dxa"/>
+        </w:trPr>
+        <w:tc>
+          <w:tcPr>
+            <w:tcW w:w="0" w:type="auto"/>
+            <w:vAlign w:val="center"/>
+            <w:hideMark/>
+          </w:tcPr>
+          <w:p>
+            <w:pPr>
+              <w:rPr>
+                <w:lang w:val="tr-TR"/>
+              </w:rPr>
+            </w:pPr>
+            <w:hyperlink r:id="rId7" w:history="1">
+              <w:proofErr w:type="spellStart"/>
+              <w:r>
+                <w:rPr>
+                  <w:rStyle w:val="Kpr"/>
+                  <w:lang w:val="tr-TR"/>
+                </w:rPr>
+                <w:t>harshaxnim</w:t>
+              </w:r>
+              <w:proofErr w:type="spellEnd"/>
+              <w:r>
+                <w:rPr>
+                  <w:rStyle w:val="Kpr"/>
+                  <w:lang w:val="tr-TR"/>
+                </w:rPr>
+                <w:t>/</w:t>
+              </w:r>
+              <w:proofErr w:type="spellStart"/>
+              <w:r>
+                <w:rPr>
+                  <w:rStyle w:val="Kpr"/>
+                  <w:lang w:val="tr-TR"/>
+                </w:rPr>
+                <w:t>ragdoll</w:t>
+              </w:r>
+              <w:proofErr w:type="spellEnd"/>
+            </w:hyperlink>
+          </w:p>
+        </w:tc>
+        <w:tc>
+          <w:tcPr>
+            <w:tcW w:w="0" w:type="auto"/>
+            <w:vAlign w:val="center"/>
+            <w:hideMark/>
+          </w:tcPr>
+          <w:p>
+            <w:pPr>
+              <w:rPr>
+                <w:lang w:val="tr-TR"/>
+              </w:rPr>
+            </w:pPr>
+            <w:r>
+              <w:rPr>
+                <w:lang w:val="tr-TR"/>
+              </w:rPr>
+              <w:t>Yok + C/</w:t>
+            </w:r>
+            <w:proofErr w:type="spellStart"/>
+            <w:r>
+              <w:rPr>
+                <w:lang w:val="tr-TR"/>
+              </w:rPr>
+              <w:t>OpenGL</w:t>
+            </w:r>
+            <w:proofErr w:type="spellEnd"/>
+            <w:r>
+              <w:rPr>
+                <w:lang w:val="tr-TR"/>
+              </w:rPr>
+              <w:t xml:space="preserve"> + </w:t>
+            </w:r>
+            <w:proofErr w:type="spellStart"/>
+            <w:r>
+              <w:rPr>
+                <w:lang w:val="tr-TR"/>
+              </w:rPr>
+              <w:t>binary</w:t>
+            </w:r>
+            <w:proofErr w:type="spellEnd"/>
+          </w:p>
+        </w:tc>
+        <w:tc>
+          <w:tcPr>
+            <w:tcW w:w="0" w:type="auto"/>
+            <w:vAlign w:val="center"/>
+            <w:hideMark/>
+          </w:tcPr>
+          <w:p>
+            <w:pPr>
+              <w:rPr>
+                <w:lang w:val="tr-TR"/>
+              </w:rPr>
+            </w:pPr>
+            <w:r>
+              <w:rPr>
+                <w:b/>
+                <w:bCs/>
+                <w:lang w:val="tr-TR"/>
+              </w:rPr>
+              <w:t>Kullanılmadı</w:t>
+            </w:r>
+          </w:p>
+        </w:tc>
+      </w:tr>
+      <w:tr>
+        <w:trPr>
+          <w:tblCellSpacing w:w="15" w:type="dxa"/>
+        </w:trPr>
+        <w:tc>
+          <w:tcPr>
+            <w:tcW w:w="0" w:type="auto"/>
+            <w:vAlign w:val="center"/>
+            <w:hideMark/>
+          </w:tcPr>
+          <w:p>
+            <w:pPr>
+              <w:rPr>
+                <w:lang w:val="tr-TR"/>
+              </w:rPr>
+            </w:pPr>
+            <w:hyperlink r:id="rId8" w:history="1">
+              <w:proofErr w:type="spellStart"/>
+              <w:r>
+                <w:rPr>
+                  <w:rStyle w:val="Kpr"/>
+                  <w:lang w:val="tr-TR"/>
+                </w:rPr>
+                <w:t>nbogie</w:t>
+              </w:r>
+              <w:proofErr w:type="spellEnd"/>
+              <w:r>
+                <w:rPr>
+                  <w:rStyle w:val="Kpr"/>
+                  <w:lang w:val="tr-TR"/>
+                </w:rPr>
+                <w:t>/p5js-ik-tentacles</w:t>
+              </w:r>
+            </w:hyperlink>
+          </w:p>
+        </w:tc>
+        <w:tc>
+          <w:tcPr>
+            <w:tcW w:w="0" w:type="auto"/>
+            <w:vAlign w:val="center"/>
+            <w:hideMark/>
+          </w:tcPr>
+          <w:p>
+            <w:pPr>
+              <w:rPr>
+                <w:lang w:val="tr-TR"/>
+              </w:rPr>
+            </w:pPr>
+            <w:r>
+              <w:rPr>
+                <w:lang w:val="tr-TR"/>
+              </w:rPr>
+              <w:t>Yok</w:t>
+            </w:r>
+          </w:p>
+        </w:tc>
+        <w:tc>
+          <w:tcPr>
+            <w:tcW w:w="0" w:type="auto"/>
+            <w:vAlign w:val="center"/>
+            <w:hideMark/>
+          </w:tcPr>
+          <w:p>
+            <w:pPr>
+              <w:rPr>
+                <w:lang w:val="tr-TR"/>
+              </w:rPr>
+            </w:pPr>
+            <w:r>
+              <w:rPr>
+                <w:b/>
+                <w:bCs/>
+                <w:lang w:val="tr-TR"/>
+              </w:rPr>
+              <w:t>Kullanılmadı</w:t>
+            </w:r>
+          </w:p>
+        </w:tc>
+      </w:tr>
+    </w:tbl>
+    <w:p>
+      <w:pPr>
+        <w:rPr>
+          <w:b/>
+          <w:bCs/>
+          <w:lang w:val="tr-TR"/>
+        </w:rPr>
+      </w:pPr>
+      <w:r>
+        <w:rPr>
+          <w:b/>
+          <w:bCs/>
+          <w:lang w:val="tr-TR"/>
+        </w:rPr>
+        <w:t>Yol haritası</w:t>
       </w:r>
     </w:p>
     <w:p>
       <w:pPr>
         <w:numPr>
           <w:ilvl w:val="0"/>
-          <w:numId w:val="4"/>
+          <w:numId w:val="6"/>
         </w:numPr>
         <w:rPr>
           <w:lang w:val="tr-TR"/>
@@ -808,44 +1759,37 @@
       </w:pPr>
       <w:r>
         <w:rPr>
-          <w:lang w:val="tr-TR"/>
-        </w:rPr>
-        <w:t>Kişi 1: AI ajanlarına (Claude/</w:t>
-      </w:r>
-      <w:proofErr w:type="spellStart"/>
-      <w:r>
-        <w:rPr>
-          <w:lang w:val="tr-TR"/>
-        </w:rPr>
-        <w:t>Cursor</w:t>
-      </w:r>
-      <w:proofErr w:type="spellEnd"/>
-      <w:r>
-        <w:rPr>
-          <w:lang w:val="tr-TR"/>
-        </w:rPr>
-        <w:t>) fizik/</w:t>
-      </w:r>
-      <w:proofErr w:type="spellStart"/>
-      <w:r>
-        <w:rPr>
-          <w:lang w:val="tr-TR"/>
-        </w:rPr>
-        <w:t>render</w:t>
-      </w:r>
-      <w:proofErr w:type="spellEnd"/>
-      <w:r>
-        <w:rPr>
-          <w:lang w:val="tr-TR"/>
-        </w:rPr>
-        <w:t xml:space="preserve"> kodunu yazdırma, mimariyi birleştirme.</w:t>
+          <w:rFonts w:ascii="Segoe UI Emoji" w:hAnsi="Segoe UI Emoji" w:cs="Segoe UI Emoji"/>
+          <w:lang w:val="tr-TR"/>
+        </w:rPr>
+        <w:t>✅</w:t>
+      </w:r>
+      <w:r>
+        <w:rPr>
+          <w:lang w:val="tr-TR"/>
+        </w:rPr>
+        <w:t xml:space="preserve"> </w:t>
+      </w:r>
+      <w:proofErr w:type="spellStart"/>
+      <w:r>
+        <w:rPr>
+          <w:lang w:val="tr-TR"/>
+        </w:rPr>
+        <w:t>Verlet</w:t>
+      </w:r>
+      <w:proofErr w:type="spellEnd"/>
+      <w:r>
+        <w:rPr>
+          <w:lang w:val="tr-TR"/>
+        </w:rPr>
+        <w:t xml:space="preserve"> zinciri (kuyruk/kol) — organik vs. robotik karşılaştırma</w:t>
       </w:r>
     </w:p>
     <w:p>
       <w:pPr>
         <w:numPr>
           <w:ilvl w:val="0"/>
-          <w:numId w:val="4"/>
+          <w:numId w:val="6"/>
         </w:numPr>
         <w:rPr>
           <w:lang w:val="tr-TR"/>
@@ -853,75 +1797,532 @@
       </w:pPr>
       <w:r>
         <w:rPr>
-          <w:lang w:val="tr-TR"/>
-        </w:rPr>
-        <w:t xml:space="preserve">Kişi 2: Katman görsellerini üretme, sürtünme/yerçekimi/yay sabitlerini elle ayarlayıp "organik" hissi yakalama (bu kısım sanatsal, </w:t>
-      </w:r>
-      <w:proofErr w:type="spellStart"/>
-      <w:r>
-        <w:rPr>
-          <w:lang w:val="tr-TR"/>
-        </w:rPr>
-        <w:t>AI'nin</w:t>
-      </w:r>
-      <w:proofErr w:type="spellEnd"/>
-      <w:r>
-        <w:rPr>
-          <w:lang w:val="tr-TR"/>
-        </w:rPr>
-        <w:t xml:space="preserve"> test edemeyeceği bir alan).</w:t>
-      </w:r>
-    </w:p>
-    <w:p>
-      <w:pPr>
+          <w:rFonts w:ascii="Segoe UI Emoji" w:hAnsi="Segoe UI Emoji" w:cs="Segoe UI Emoji"/>
+          <w:lang w:val="tr-TR"/>
+        </w:rPr>
+        <w:t>✅</w:t>
+      </w:r>
+      <w:r>
+        <w:rPr>
+          <w:lang w:val="tr-TR"/>
+        </w:rPr>
+        <w:t xml:space="preserve"> FABRIK ile hedefe uzanma / </w:t>
+      </w:r>
+      <w:proofErr w:type="spellStart"/>
+      <w:r>
+        <w:rPr>
+          <w:lang w:val="tr-TR"/>
+        </w:rPr>
+        <w:t>foot-planting</w:t>
+      </w:r>
+      <w:proofErr w:type="spellEnd"/>
+      <w:r>
+        <w:rPr>
+          <w:lang w:val="tr-TR"/>
+        </w:rPr>
+        <w:t xml:space="preserve"> yürüyüş</w:t>
+      </w:r>
+    </w:p>
+    <w:p>
+      <w:pPr>
+        <w:numPr>
+          <w:ilvl w:val="0"/>
+          <w:numId w:val="6"/>
+        </w:numPr>
+        <w:rPr>
+          <w:lang w:val="tr-TR"/>
+        </w:rPr>
+      </w:pPr>
+      <w:r>
+        <w:rPr>
+          <w:rFonts w:ascii="Segoe UI Emoji" w:hAnsi="Segoe UI Emoji" w:cs="Segoe UI Emoji"/>
+          <w:lang w:val="tr-TR"/>
+        </w:rPr>
+        <w:t>✅</w:t>
+      </w:r>
+      <w:r>
+        <w:rPr>
+          <w:lang w:val="tr-TR"/>
+        </w:rPr>
+        <w:t xml:space="preserve"> Gövde + baş + 2 kol + 2 bacaktan oluşan tam iskelet, diz açı sınırı </w:t>
+      </w:r>
+    </w:p>
+    <w:p>
+      <w:pPr>
+        <w:numPr>
+          <w:ilvl w:val="1"/>
+          <w:numId w:val="6"/>
+        </w:numPr>
+        <w:rPr>
+          <w:lang w:val="tr-TR"/>
+        </w:rPr>
+      </w:pPr>
+      <w:r>
+        <w:rPr>
+          <w:lang w:val="tr-TR"/>
+        </w:rPr>
+        <w:t>Önemli ders: gövde/boyun tamamen serbest bırakılınca "</w:t>
+      </w:r>
+      <w:proofErr w:type="spellStart"/>
+      <w:r>
+        <w:rPr>
+          <w:lang w:val="tr-TR"/>
+        </w:rPr>
+        <w:t>double</w:t>
+      </w:r>
+      <w:proofErr w:type="spellEnd"/>
+      <w:r>
+        <w:rPr>
+          <w:lang w:val="tr-TR"/>
+        </w:rPr>
+        <w:t xml:space="preserve"> </w:t>
+      </w:r>
+      <w:proofErr w:type="spellStart"/>
+      <w:r>
+        <w:rPr>
+          <w:lang w:val="tr-TR"/>
+        </w:rPr>
+        <w:t>pendulum</w:t>
+      </w:r>
+      <w:proofErr w:type="spellEnd"/>
+      <w:r>
+        <w:rPr>
+          <w:lang w:val="tr-TR"/>
+        </w:rPr>
+        <w:t xml:space="preserve">" kaosuna girip takla attı. </w:t>
+      </w:r>
+      <w:proofErr w:type="spellStart"/>
+      <w:r>
+        <w:rPr>
+          <w:lang w:val="tr-TR"/>
+        </w:rPr>
+        <w:t>clamp_direction</w:t>
+      </w:r>
+      <w:proofErr w:type="spellEnd"/>
+      <w:r>
+        <w:rPr>
+          <w:lang w:val="tr-TR"/>
+        </w:rPr>
+        <w:t xml:space="preserve">() ile (sabit global "yukarı" referansına göre) düzeltildi — detay </w:t>
+      </w:r>
+      <w:proofErr w:type="spellStart"/>
+      <w:r>
+        <w:rPr>
+          <w:lang w:val="tr-TR"/>
+        </w:rPr>
+        <w:t>README'de</w:t>
+      </w:r>
+      <w:proofErr w:type="spellEnd"/>
+      <w:r>
+        <w:rPr>
+          <w:lang w:val="tr-TR"/>
+        </w:rPr>
+        <w:t>.</w:t>
+      </w:r>
+    </w:p>
+    <w:p>
+      <w:pPr>
+        <w:numPr>
+          <w:ilvl w:val="0"/>
+          <w:numId w:val="6"/>
+        </w:numPr>
+        <w:rPr>
+          <w:lang w:val="tr-TR"/>
+        </w:rPr>
+      </w:pPr>
+      <w:r>
+        <w:rPr>
+          <w:rFonts w:ascii="Segoe UI Emoji" w:hAnsi="Segoe UI Emoji" w:cs="Segoe UI Emoji"/>
+          <w:lang w:val="tr-TR"/>
+        </w:rPr>
+        <w:t>✅</w:t>
+      </w:r>
+      <w:r>
+        <w:rPr>
+          <w:lang w:val="tr-TR"/>
+        </w:rPr>
+        <w:t xml:space="preserve"> Yürüyüş döngüsü ince ayarı: </w:t>
+      </w:r>
+    </w:p>
+    <w:p>
+      <w:pPr>
+        <w:numPr>
+          <w:ilvl w:val="1"/>
+          <w:numId w:val="6"/>
+        </w:numPr>
+        <w:rPr>
+          <w:lang w:val="tr-TR"/>
+        </w:rPr>
+      </w:pPr>
+      <w:r>
+        <w:rPr>
+          <w:lang w:val="tr-TR"/>
+        </w:rPr>
+        <w:t>Her kol artık kendi PINNED omuz tutamağından (</w:t>
+      </w:r>
+      <w:proofErr w:type="spellStart"/>
+      <w:r>
+        <w:rPr>
+          <w:lang w:val="tr-TR"/>
+        </w:rPr>
+        <w:t>l_anchor</w:t>
+      </w:r>
+      <w:proofErr w:type="spellEnd"/>
+      <w:r>
+        <w:rPr>
+          <w:lang w:val="tr-TR"/>
+        </w:rPr>
+        <w:t>/</w:t>
+      </w:r>
+      <w:proofErr w:type="spellStart"/>
+      <w:r>
+        <w:rPr>
+          <w:lang w:val="tr-TR"/>
+        </w:rPr>
+        <w:t>r_anchor</w:t>
+      </w:r>
+      <w:proofErr w:type="spellEnd"/>
+      <w:r>
+        <w:rPr>
+          <w:lang w:val="tr-TR"/>
+        </w:rPr>
+        <w:t xml:space="preserve">) sarkıyor; bu tutamak karşı bacağın </w:t>
+      </w:r>
+      <w:proofErr w:type="spellStart"/>
+      <w:r>
+        <w:rPr>
+          <w:lang w:val="tr-TR"/>
+        </w:rPr>
+        <w:t>swing</w:t>
+      </w:r>
+      <w:proofErr w:type="spellEnd"/>
+      <w:r>
+        <w:rPr>
+          <w:lang w:val="tr-TR"/>
+        </w:rPr>
+        <w:t xml:space="preserve"> ilerlemesine bağlı olarak öne/geriye kayıyor (</w:t>
+      </w:r>
+      <w:proofErr w:type="spellStart"/>
+      <w:r>
+        <w:rPr>
+          <w:lang w:val="tr-TR"/>
+        </w:rPr>
+        <w:t>contralateral</w:t>
+      </w:r>
+      <w:proofErr w:type="spellEnd"/>
+      <w:r>
+        <w:rPr>
+          <w:lang w:val="tr-TR"/>
+        </w:rPr>
+        <w:t xml:space="preserve"> kol sallanması — periyodik sin() değil, gerçek bacak durumundan tetikleniyor).</w:t>
+      </w:r>
+    </w:p>
+    <w:p>
+      <w:pPr>
+        <w:numPr>
+          <w:ilvl w:val="1"/>
+          <w:numId w:val="6"/>
+        </w:numPr>
+        <w:rPr>
+          <w:lang w:val="tr-TR"/>
+        </w:rPr>
+      </w:pPr>
+      <w:proofErr w:type="spellStart"/>
+      <w:r>
+        <w:rPr>
+          <w:lang w:val="tr-TR"/>
+        </w:rPr>
+        <w:t>VerletSystem.gravity</w:t>
+      </w:r>
+      <w:proofErr w:type="spellEnd"/>
+      <w:r>
+        <w:rPr>
+          <w:lang w:val="tr-TR"/>
+        </w:rPr>
+        <w:t xml:space="preserve"> / .</w:t>
+      </w:r>
+      <w:proofErr w:type="spellStart"/>
+      <w:r>
+        <w:rPr>
+          <w:lang w:val="tr-TR"/>
+        </w:rPr>
+        <w:t>friction</w:t>
+      </w:r>
+      <w:proofErr w:type="spellEnd"/>
+      <w:r>
+        <w:rPr>
+          <w:lang w:val="tr-TR"/>
+        </w:rPr>
+        <w:t xml:space="preserve"> bu karakter için görsel olarak kalibre edildi (</w:t>
+      </w:r>
+      <w:proofErr w:type="spellStart"/>
+      <w:r>
+        <w:rPr>
+          <w:lang w:val="tr-TR"/>
+        </w:rPr>
+        <w:t>gravity</w:t>
+      </w:r>
+      <w:proofErr w:type="spellEnd"/>
+      <w:r>
+        <w:rPr>
+          <w:lang w:val="tr-TR"/>
+        </w:rPr>
+        <w:t xml:space="preserve"> 0.05→0.065, </w:t>
+      </w:r>
+      <w:proofErr w:type="spellStart"/>
+      <w:r>
+        <w:rPr>
+          <w:lang w:val="tr-TR"/>
+        </w:rPr>
+        <w:t>friction</w:t>
+      </w:r>
+      <w:proofErr w:type="spellEnd"/>
+      <w:r>
+        <w:rPr>
+          <w:lang w:val="tr-TR"/>
+        </w:rPr>
+        <w:t xml:space="preserve"> 0.02→0.045).</w:t>
+      </w:r>
+    </w:p>
+    <w:p>
+      <w:pPr>
+        <w:numPr>
+          <w:ilvl w:val="1"/>
+          <w:numId w:val="6"/>
+        </w:numPr>
+        <w:rPr>
+          <w:lang w:val="tr-TR"/>
+        </w:rPr>
+      </w:pPr>
+      <w:proofErr w:type="spellStart"/>
+      <w:r>
         <w:rPr>
           <w:b/>
           <w:bCs/>
           <w:lang w:val="tr-TR"/>
         </w:rPr>
-      </w:pPr>
+        <w:lastRenderedPageBreak/>
+        <w:t>Bug</w:t>
+      </w:r>
+      <w:proofErr w:type="spellEnd"/>
       <w:r>
         <w:rPr>
           <w:b/>
           <w:bCs/>
           <w:lang w:val="tr-TR"/>
         </w:rPr>
-        <w:lastRenderedPageBreak/>
-        <w:t>Ertelenen konular</w:t>
+        <w:t xml:space="preserve"> </w:t>
+      </w:r>
+      <w:proofErr w:type="spellStart"/>
+      <w:r>
+        <w:rPr>
+          <w:b/>
+          <w:bCs/>
+          <w:lang w:val="tr-TR"/>
+        </w:rPr>
+        <w:t>fix</w:t>
+      </w:r>
+      <w:proofErr w:type="spellEnd"/>
+      <w:r>
+        <w:rPr>
+          <w:b/>
+          <w:bCs/>
+          <w:lang w:val="tr-TR"/>
+        </w:rPr>
+        <w:t xml:space="preserve"> (kullanıcı bildirdi — omuz/kol titremesi):</w:t>
+      </w:r>
+      <w:r>
+        <w:rPr>
+          <w:lang w:val="tr-TR"/>
+        </w:rPr>
+        <w:t xml:space="preserve"> </w:t>
+      </w:r>
+      <w:proofErr w:type="spellStart"/>
+      <w:r>
+        <w:rPr>
+          <w:lang w:val="tr-TR"/>
+        </w:rPr>
+        <w:t>pinned</w:t>
+      </w:r>
+      <w:proofErr w:type="spellEnd"/>
+      <w:r>
+        <w:rPr>
+          <w:lang w:val="tr-TR"/>
+        </w:rPr>
+        <w:t xml:space="preserve"> noktalar (</w:t>
+      </w:r>
+      <w:proofErr w:type="spellStart"/>
+      <w:r>
+        <w:rPr>
+          <w:lang w:val="tr-TR"/>
+        </w:rPr>
+        <w:t>driver</w:t>
+      </w:r>
+      <w:proofErr w:type="spellEnd"/>
+      <w:r>
+        <w:rPr>
+          <w:lang w:val="tr-TR"/>
+        </w:rPr>
+        <w:t>/</w:t>
+      </w:r>
+      <w:proofErr w:type="spellStart"/>
+      <w:r>
+        <w:rPr>
+          <w:lang w:val="tr-TR"/>
+        </w:rPr>
+        <w:t>l_anchor</w:t>
+      </w:r>
+      <w:proofErr w:type="spellEnd"/>
+      <w:r>
+        <w:rPr>
+          <w:lang w:val="tr-TR"/>
+        </w:rPr>
+        <w:t>/</w:t>
+      </w:r>
+      <w:proofErr w:type="spellStart"/>
+      <w:r>
+        <w:rPr>
+          <w:lang w:val="tr-TR"/>
+        </w:rPr>
+        <w:t>r_anchor</w:t>
+      </w:r>
+      <w:proofErr w:type="spellEnd"/>
+      <w:r>
+        <w:rPr>
+          <w:lang w:val="tr-TR"/>
+        </w:rPr>
+        <w:t>) _</w:t>
+      </w:r>
+      <w:proofErr w:type="spellStart"/>
+      <w:r>
+        <w:rPr>
+          <w:lang w:val="tr-TR"/>
+        </w:rPr>
+        <w:t>integrate</w:t>
+      </w:r>
+      <w:proofErr w:type="spellEnd"/>
+      <w:r>
+        <w:rPr>
+          <w:lang w:val="tr-TR"/>
+        </w:rPr>
+        <w:t>()'te hâlâ hız/yerçekimiyle entegre ediliyordu; _</w:t>
+      </w:r>
+      <w:proofErr w:type="spellStart"/>
+      <w:r>
+        <w:rPr>
+          <w:lang w:val="tr-TR"/>
+        </w:rPr>
+        <w:t>reapply_pins</w:t>
+      </w:r>
+      <w:proofErr w:type="spellEnd"/>
+      <w:r>
+        <w:rPr>
+          <w:lang w:val="tr-TR"/>
+        </w:rPr>
+        <w:t xml:space="preserve">() sadece </w:t>
+      </w:r>
+      <w:proofErr w:type="spellStart"/>
+      <w:r>
+        <w:rPr>
+          <w:lang w:val="tr-TR"/>
+        </w:rPr>
+        <w:t>prev_points'i</w:t>
+      </w:r>
+      <w:proofErr w:type="spellEnd"/>
+      <w:r>
+        <w:rPr>
+          <w:lang w:val="tr-TR"/>
+        </w:rPr>
+        <w:t xml:space="preserve"> düzeltip asıl konum kaymasını geri almıyordu. Düzeltme: </w:t>
+      </w:r>
+      <w:proofErr w:type="spellStart"/>
+      <w:r>
+        <w:rPr>
+          <w:lang w:val="tr-TR"/>
+        </w:rPr>
+        <w:t>pinned</w:t>
+      </w:r>
+      <w:proofErr w:type="spellEnd"/>
+      <w:r>
+        <w:rPr>
+          <w:lang w:val="tr-TR"/>
+        </w:rPr>
+        <w:t xml:space="preserve"> noktalar artık _</w:t>
+      </w:r>
+      <w:proofErr w:type="spellStart"/>
+      <w:r>
+        <w:rPr>
+          <w:lang w:val="tr-TR"/>
+        </w:rPr>
+        <w:t>integrate</w:t>
+      </w:r>
+      <w:proofErr w:type="spellEnd"/>
+      <w:r>
+        <w:rPr>
+          <w:lang w:val="tr-TR"/>
+        </w:rPr>
+        <w:t xml:space="preserve">()'te tamamen muaf. Sayısal doğrulama: el noktası kare-başı yer değiştirmesi </w:t>
+      </w:r>
+      <w:proofErr w:type="spellStart"/>
+      <w:r>
+        <w:rPr>
+          <w:lang w:val="tr-TR"/>
+        </w:rPr>
+        <w:t>ort.</w:t>
+      </w:r>
+      <w:proofErr w:type="spellEnd"/>
+      <w:r>
+        <w:rPr>
+          <w:lang w:val="tr-TR"/>
+        </w:rPr>
+        <w:t xml:space="preserve"> 6.5px/</w:t>
+      </w:r>
+      <w:proofErr w:type="spellStart"/>
+      <w:r>
+        <w:rPr>
+          <w:lang w:val="tr-TR"/>
+        </w:rPr>
+        <w:t>max</w:t>
+      </w:r>
+      <w:proofErr w:type="spellEnd"/>
+      <w:r>
+        <w:rPr>
+          <w:lang w:val="tr-TR"/>
+        </w:rPr>
+        <w:t xml:space="preserve"> 46px (34 yön değişimi) → 2.2px/</w:t>
+      </w:r>
+      <w:proofErr w:type="spellStart"/>
+      <w:r>
+        <w:rPr>
+          <w:lang w:val="tr-TR"/>
+        </w:rPr>
+        <w:t>max</w:t>
+      </w:r>
+      <w:proofErr w:type="spellEnd"/>
+      <w:r>
+        <w:rPr>
+          <w:lang w:val="tr-TR"/>
+        </w:rPr>
+        <w:t xml:space="preserve"> 8px (9 yön değişimi).</w:t>
       </w:r>
     </w:p>
     <w:p>
       <w:pPr>
         <w:numPr>
           <w:ilvl w:val="0"/>
-          <w:numId w:val="5"/>
+          <w:numId w:val="6"/>
         </w:numPr>
         <w:rPr>
           <w:lang w:val="tr-TR"/>
         </w:rPr>
       </w:pPr>
-      <w:proofErr w:type="spellStart"/>
-      <w:r>
-        <w:rPr>
-          <w:lang w:val="tr-TR"/>
-        </w:rPr>
-        <w:t>Praglish'e</w:t>
-      </w:r>
-      <w:proofErr w:type="spellEnd"/>
-      <w:r>
-        <w:rPr>
-          <w:lang w:val="tr-TR"/>
-        </w:rPr>
-        <w:t xml:space="preserve"> "yeni mod" olarak entegrasyon (</w:t>
-      </w:r>
-      <w:proofErr w:type="spellStart"/>
-      <w:r>
-        <w:rPr>
-          <w:lang w:val="tr-TR"/>
-        </w:rPr>
-        <w:t>Praglish'in</w:t>
-      </w:r>
-      <w:proofErr w:type="spellEnd"/>
+      <w:r>
+        <w:rPr>
+          <w:rFonts w:ascii="Segoe UI Emoji" w:hAnsi="Segoe UI Emoji" w:cs="Segoe UI Emoji"/>
+          <w:lang w:val="tr-TR"/>
+        </w:rPr>
+        <w:t>✅</w:t>
+      </w:r>
       <w:r>
         <w:rPr>
           <w:lang w:val="tr-TR"/>
@@ -933,26 +2334,891 @@
         <w:rPr>
           <w:lang w:val="tr-TR"/>
         </w:rPr>
-        <w:t>stack'i</w:t>
-      </w:r>
-      <w:proofErr w:type="spellEnd"/>
-      <w:r>
-        <w:rPr>
-          <w:lang w:val="tr-TR"/>
-        </w:rPr>
-        <w:t xml:space="preserve"> netleşince tekrar ele alınacak)</w:t>
+        <w:t>Parallax</w:t>
+      </w:r>
+      <w:proofErr w:type="spellEnd"/>
+      <w:r>
+        <w:rPr>
+          <w:lang w:val="tr-TR"/>
+        </w:rPr>
+        <w:t xml:space="preserve"> arka plan katmanları (</w:t>
+      </w:r>
+      <w:proofErr w:type="spellStart"/>
+      <w:r>
+        <w:rPr>
+          <w:lang w:val="tr-TR"/>
+        </w:rPr>
+        <w:t>screen_x</w:t>
+      </w:r>
+      <w:proofErr w:type="spellEnd"/>
+      <w:r>
+        <w:rPr>
+          <w:lang w:val="tr-TR"/>
+        </w:rPr>
+        <w:t xml:space="preserve"> = </w:t>
+      </w:r>
+      <w:proofErr w:type="spellStart"/>
+      <w:r>
+        <w:rPr>
+          <w:lang w:val="tr-TR"/>
+        </w:rPr>
+        <w:t>world_x</w:t>
+      </w:r>
+      <w:proofErr w:type="spellEnd"/>
+      <w:r>
+        <w:rPr>
+          <w:lang w:val="tr-TR"/>
+        </w:rPr>
+        <w:t>*</w:t>
+      </w:r>
+      <w:proofErr w:type="spellStart"/>
+      <w:r>
+        <w:rPr>
+          <w:lang w:val="tr-TR"/>
+        </w:rPr>
+        <w:t>depth</w:t>
+      </w:r>
+      <w:proofErr w:type="spellEnd"/>
+      <w:r>
+        <w:rPr>
+          <w:lang w:val="tr-TR"/>
+        </w:rPr>
+        <w:t xml:space="preserve"> + (W/2 - </w:t>
+      </w:r>
+      <w:proofErr w:type="spellStart"/>
+      <w:r>
+        <w:rPr>
+          <w:lang w:val="tr-TR"/>
+        </w:rPr>
+        <w:t>hip_x</w:t>
+      </w:r>
+      <w:proofErr w:type="spellEnd"/>
+      <w:r>
+        <w:rPr>
+          <w:lang w:val="tr-TR"/>
+        </w:rPr>
+        <w:t>*</w:t>
+      </w:r>
+      <w:proofErr w:type="spellStart"/>
+      <w:r>
+        <w:rPr>
+          <w:lang w:val="tr-TR"/>
+        </w:rPr>
+        <w:t>depth</w:t>
+      </w:r>
+      <w:proofErr w:type="spellEnd"/>
+      <w:r>
+        <w:rPr>
+          <w:lang w:val="tr-TR"/>
+        </w:rPr>
+        <w:t xml:space="preserve">)) </w:t>
+      </w:r>
+    </w:p>
+    <w:p>
+      <w:pPr>
+        <w:numPr>
+          <w:ilvl w:val="1"/>
+          <w:numId w:val="6"/>
+        </w:numPr>
+        <w:rPr>
+          <w:lang w:val="tr-TR"/>
+        </w:rPr>
+      </w:pPr>
+      <w:proofErr w:type="spellStart"/>
+      <w:r>
+        <w:rPr>
+          <w:b/>
+          <w:bCs/>
+          <w:lang w:val="tr-TR"/>
+        </w:rPr>
+        <w:t>Bug</w:t>
+      </w:r>
+      <w:proofErr w:type="spellEnd"/>
+      <w:r>
+        <w:rPr>
+          <w:b/>
+          <w:bCs/>
+          <w:lang w:val="tr-TR"/>
+        </w:rPr>
+        <w:t xml:space="preserve"> </w:t>
+      </w:r>
+      <w:proofErr w:type="spellStart"/>
+      <w:r>
+        <w:rPr>
+          <w:b/>
+          <w:bCs/>
+          <w:lang w:val="tr-TR"/>
+        </w:rPr>
+        <w:t>fix</w:t>
+      </w:r>
+      <w:proofErr w:type="spellEnd"/>
+      <w:r>
+        <w:rPr>
+          <w:b/>
+          <w:bCs/>
+          <w:lang w:val="tr-TR"/>
+        </w:rPr>
+        <w:t xml:space="preserve"> (kullanıcı bildirdi — bacaklar robotik):</w:t>
+      </w:r>
+      <w:r>
+        <w:rPr>
+          <w:lang w:val="tr-TR"/>
+        </w:rPr>
+        <w:t xml:space="preserve"> LEG_SEGMENT_LEN=75 iken bacağın toplam erişimi (150px) kalça-zemin dikey mesafesinden (160px) azdı → </w:t>
+      </w:r>
+      <w:proofErr w:type="spellStart"/>
+      <w:r>
+        <w:rPr>
+          <w:lang w:val="tr-TR"/>
+        </w:rPr>
+        <w:t>stance</w:t>
+      </w:r>
+      <w:proofErr w:type="spellEnd"/>
+      <w:r>
+        <w:rPr>
+          <w:lang w:val="tr-TR"/>
+        </w:rPr>
+        <w:t xml:space="preserve"> fazının neredeyse tamamında FABRIK hedefi "erişilemez" görüp zinciri dümdüz gerdi (diz hiç bükülmedi, "sopa bacak" görünümü). Aynı </w:t>
+      </w:r>
+      <w:proofErr w:type="spellStart"/>
+      <w:r>
+        <w:rPr>
+          <w:lang w:val="tr-TR"/>
+        </w:rPr>
+        <w:t>bug</w:t>
+      </w:r>
+      <w:proofErr w:type="spellEnd"/>
+      <w:r>
+        <w:rPr>
+          <w:lang w:val="tr-TR"/>
+        </w:rPr>
+        <w:t xml:space="preserve"> step3/step4'te de vardı. Düzeltme: LEG_SEGMENT_LEN 75→92 (erişim 184px, 160'ı rahatça aşıyor) + </w:t>
+      </w:r>
+      <w:proofErr w:type="spellStart"/>
+      <w:r>
+        <w:rPr>
+          <w:lang w:val="tr-TR"/>
+        </w:rPr>
+        <w:t>swing</w:t>
+      </w:r>
+      <w:proofErr w:type="spellEnd"/>
+      <w:r>
+        <w:rPr>
+          <w:lang w:val="tr-TR"/>
+        </w:rPr>
+        <w:t xml:space="preserve"> fazındaki lineer x enterpolasyonu </w:t>
+      </w:r>
+      <w:proofErr w:type="spellStart"/>
+      <w:r>
+        <w:rPr>
+          <w:lang w:val="tr-TR"/>
+        </w:rPr>
+        <w:t>ease</w:t>
+      </w:r>
+      <w:proofErr w:type="spellEnd"/>
+      <w:r>
+        <w:rPr>
+          <w:lang w:val="tr-TR"/>
+        </w:rPr>
+        <w:t>-in/</w:t>
+      </w:r>
+      <w:proofErr w:type="spellStart"/>
+      <w:r>
+        <w:rPr>
+          <w:lang w:val="tr-TR"/>
+        </w:rPr>
+        <w:t>out</w:t>
+      </w:r>
+      <w:proofErr w:type="spellEnd"/>
+      <w:r>
+        <w:rPr>
+          <w:lang w:val="tr-TR"/>
+        </w:rPr>
+        <w:t xml:space="preserve"> (</w:t>
+      </w:r>
+      <w:proofErr w:type="spellStart"/>
+      <w:r>
+        <w:rPr>
+          <w:lang w:val="tr-TR"/>
+        </w:rPr>
+        <w:t>smoothstep</w:t>
+      </w:r>
+      <w:proofErr w:type="spellEnd"/>
+      <w:r>
+        <w:rPr>
+          <w:lang w:val="tr-TR"/>
+        </w:rPr>
+        <w:t xml:space="preserve">) eğrisine çevrildi. Sayısal doğrulama (tam yürüyüş simülasyonu, diz açısı): </w:t>
+      </w:r>
+      <w:proofErr w:type="spellStart"/>
+      <w:r>
+        <w:rPr>
+          <w:lang w:val="tr-TR"/>
+        </w:rPr>
+        <w:t>ort.</w:t>
+      </w:r>
+      <w:proofErr w:type="spellEnd"/>
+      <w:r>
+        <w:rPr>
+          <w:lang w:val="tr-TR"/>
+        </w:rPr>
+        <w:t xml:space="preserve"> 17.5°/</w:t>
+      </w:r>
+      <w:proofErr w:type="spellStart"/>
+      <w:r>
+        <w:rPr>
+          <w:lang w:val="tr-TR"/>
+        </w:rPr>
+        <w:t>max</w:t>
+      </w:r>
+      <w:proofErr w:type="spellEnd"/>
+      <w:r>
+        <w:rPr>
+          <w:lang w:val="tr-TR"/>
+        </w:rPr>
+        <w:t xml:space="preserve"> 49° (</w:t>
+      </w:r>
+      <w:proofErr w:type="spellStart"/>
+      <w:r>
+        <w:rPr>
+          <w:lang w:val="tr-TR"/>
+        </w:rPr>
+        <w:t>std</w:t>
+      </w:r>
+      <w:proofErr w:type="spellEnd"/>
+      <w:r>
+        <w:rPr>
+          <w:lang w:val="tr-TR"/>
+        </w:rPr>
+        <w:t xml:space="preserve"> 15.2) → </w:t>
+      </w:r>
+      <w:proofErr w:type="spellStart"/>
+      <w:r>
+        <w:rPr>
+          <w:lang w:val="tr-TR"/>
+        </w:rPr>
+        <w:t>ort.</w:t>
+      </w:r>
+      <w:proofErr w:type="spellEnd"/>
+      <w:r>
+        <w:rPr>
+          <w:lang w:val="tr-TR"/>
+        </w:rPr>
+        <w:t xml:space="preserve"> 37.8°/</w:t>
+      </w:r>
+      <w:proofErr w:type="spellStart"/>
+      <w:r>
+        <w:rPr>
+          <w:lang w:val="tr-TR"/>
+        </w:rPr>
+        <w:t>max</w:t>
+      </w:r>
+      <w:proofErr w:type="spellEnd"/>
+      <w:r>
+        <w:rPr>
+          <w:lang w:val="tr-TR"/>
+        </w:rPr>
+        <w:t xml:space="preserve"> 84° (</w:t>
+      </w:r>
+      <w:proofErr w:type="spellStart"/>
+      <w:r>
+        <w:rPr>
+          <w:lang w:val="tr-TR"/>
+        </w:rPr>
+        <w:t>std</w:t>
+      </w:r>
+      <w:proofErr w:type="spellEnd"/>
+      <w:r>
+        <w:rPr>
+          <w:lang w:val="tr-TR"/>
+        </w:rPr>
+        <w:t xml:space="preserve"> 30.5).</w:t>
       </w:r>
     </w:p>
     <w:p>
       <w:pPr>
         <w:numPr>
           <w:ilvl w:val="0"/>
-          <w:numId w:val="5"/>
+          <w:numId w:val="6"/>
         </w:numPr>
         <w:rPr>
           <w:lang w:val="tr-TR"/>
         </w:rPr>
       </w:pPr>
+      <w:r>
+        <w:rPr>
+          <w:rFonts w:ascii="Segoe UI Emoji" w:hAnsi="Segoe UI Emoji" w:cs="Segoe UI Emoji"/>
+          <w:lang w:val="tr-TR"/>
+        </w:rPr>
+        <w:t>⏳</w:t>
+      </w:r>
+      <w:r>
+        <w:rPr>
+          <w:lang w:val="tr-TR"/>
+        </w:rPr>
+        <w:t xml:space="preserve"> Senaryo/diyalog sistemi</w:t>
+      </w:r>
+    </w:p>
+    <w:p>
+      <w:pPr>
+        <w:numPr>
+          <w:ilvl w:val="0"/>
+          <w:numId w:val="6"/>
+        </w:numPr>
+        <w:rPr>
+          <w:lang w:val="tr-TR"/>
+        </w:rPr>
+      </w:pPr>
+      <w:r>
+        <w:rPr>
+          <w:rFonts w:ascii="Segoe UI Emoji" w:hAnsi="Segoe UI Emoji" w:cs="Segoe UI Emoji"/>
+          <w:lang w:val="tr-TR"/>
+        </w:rPr>
+        <w:t>⏳</w:t>
+      </w:r>
+      <w:r>
+        <w:rPr>
+          <w:lang w:val="tr-TR"/>
+        </w:rPr>
+        <w:t xml:space="preserve"> Momentum ve esneme (</w:t>
+      </w:r>
+      <w:proofErr w:type="spellStart"/>
+      <w:r>
+        <w:rPr>
+          <w:lang w:val="tr-TR"/>
+        </w:rPr>
+        <w:t>squash</w:t>
+      </w:r>
+      <w:proofErr w:type="spellEnd"/>
+      <w:r>
+        <w:rPr>
+          <w:lang w:val="tr-TR"/>
+        </w:rPr>
+        <w:t xml:space="preserve"> &amp; </w:t>
+      </w:r>
+      <w:proofErr w:type="spellStart"/>
+      <w:r>
+        <w:rPr>
+          <w:lang w:val="tr-TR"/>
+        </w:rPr>
+        <w:t>stretch</w:t>
+      </w:r>
+      <w:proofErr w:type="spellEnd"/>
+      <w:r>
+        <w:rPr>
+          <w:lang w:val="tr-TR"/>
+        </w:rPr>
+        <w:t xml:space="preserve">) — </w:t>
+      </w:r>
+      <w:proofErr w:type="spellStart"/>
+      <w:r>
+        <w:rPr>
+          <w:lang w:val="tr-TR"/>
+        </w:rPr>
+        <w:t>verlet</w:t>
+      </w:r>
+      <w:proofErr w:type="spellEnd"/>
+      <w:r>
+        <w:rPr>
+          <w:lang w:val="tr-TR"/>
+        </w:rPr>
+        <w:t xml:space="preserve"> zincirlerinin hıza/ düşmeye tepki olarak uzayıp büzüşmesi</w:t>
+      </w:r>
+    </w:p>
+    <w:p>
+      <w:pPr>
+        <w:numPr>
+          <w:ilvl w:val="0"/>
+          <w:numId w:val="6"/>
+        </w:numPr>
+        <w:rPr>
+          <w:lang w:val="tr-TR"/>
+        </w:rPr>
+      </w:pPr>
+      <w:r>
+        <w:rPr>
+          <w:rFonts w:ascii="Segoe UI Emoji" w:hAnsi="Segoe UI Emoji" w:cs="Segoe UI Emoji"/>
+          <w:lang w:val="tr-TR"/>
+        </w:rPr>
+        <w:t>⏳</w:t>
+      </w:r>
+      <w:r>
+        <w:rPr>
+          <w:lang w:val="tr-TR"/>
+        </w:rPr>
+        <w:t xml:space="preserve"> Çoklu nokta çarpışması (</w:t>
+      </w:r>
+      <w:proofErr w:type="spellStart"/>
+      <w:r>
+        <w:rPr>
+          <w:lang w:val="tr-TR"/>
+        </w:rPr>
+        <w:t>multi-node</w:t>
+      </w:r>
+      <w:proofErr w:type="spellEnd"/>
+      <w:r>
+        <w:rPr>
+          <w:lang w:val="tr-TR"/>
+        </w:rPr>
+        <w:t xml:space="preserve"> </w:t>
+      </w:r>
+      <w:proofErr w:type="spellStart"/>
+      <w:r>
+        <w:rPr>
+          <w:lang w:val="tr-TR"/>
+        </w:rPr>
+        <w:t>collision</w:t>
+      </w:r>
+      <w:proofErr w:type="spellEnd"/>
+      <w:r>
+        <w:rPr>
+          <w:lang w:val="tr-TR"/>
+        </w:rPr>
+        <w:t xml:space="preserve"> &amp; </w:t>
+      </w:r>
+      <w:proofErr w:type="spellStart"/>
+      <w:r>
+        <w:rPr>
+          <w:lang w:val="tr-TR"/>
+        </w:rPr>
+        <w:t>raycasting</w:t>
+      </w:r>
+      <w:proofErr w:type="spellEnd"/>
+      <w:r>
+        <w:rPr>
+          <w:lang w:val="tr-TR"/>
+        </w:rPr>
+        <w:t>) — baş/ omuz/kalça/ayaktan zemine ve engellere ışın taraması</w:t>
+      </w:r>
+    </w:p>
+    <w:p>
+      <w:pPr>
+        <w:numPr>
+          <w:ilvl w:val="0"/>
+          <w:numId w:val="6"/>
+        </w:numPr>
+        <w:rPr>
+          <w:lang w:val="tr-TR"/>
+        </w:rPr>
+      </w:pPr>
+      <w:r>
+        <w:rPr>
+          <w:rFonts w:ascii="Segoe UI Emoji" w:hAnsi="Segoe UI Emoji" w:cs="Segoe UI Emoji"/>
+          <w:lang w:val="tr-TR"/>
+        </w:rPr>
+        <w:t>⏳</w:t>
+      </w:r>
+      <w:r>
+        <w:rPr>
+          <w:lang w:val="tr-TR"/>
+        </w:rPr>
+        <w:t xml:space="preserve"> Aktif/pasif </w:t>
+      </w:r>
+      <w:proofErr w:type="spellStart"/>
+      <w:r>
+        <w:rPr>
+          <w:lang w:val="tr-TR"/>
+        </w:rPr>
+        <w:t>ragdoll</w:t>
+      </w:r>
+      <w:proofErr w:type="spellEnd"/>
+      <w:r>
+        <w:rPr>
+          <w:lang w:val="tr-TR"/>
+        </w:rPr>
+        <w:t xml:space="preserve"> harmanı — IK güdümlü "aktif" durum ile tamamen yerçekimine teslim "pasif </w:t>
+      </w:r>
+      <w:proofErr w:type="spellStart"/>
+      <w:r>
+        <w:rPr>
+          <w:lang w:val="tr-TR"/>
+        </w:rPr>
+        <w:t>ragdoll</w:t>
+      </w:r>
+      <w:proofErr w:type="spellEnd"/>
+      <w:r>
+        <w:rPr>
+          <w:lang w:val="tr-TR"/>
+        </w:rPr>
+        <w:t>" durumu arasında pürüzsüz geçiş</w:t>
+      </w:r>
+    </w:p>
+    <w:p>
+      <w:pPr>
+        <w:numPr>
+          <w:ilvl w:val="0"/>
+          <w:numId w:val="6"/>
+        </w:numPr>
+        <w:rPr>
+          <w:lang w:val="tr-TR"/>
+        </w:rPr>
+      </w:pPr>
+      <w:r>
+        <w:rPr>
+          <w:rFonts w:ascii="Segoe UI Emoji" w:hAnsi="Segoe UI Emoji" w:cs="Segoe UI Emoji"/>
+          <w:lang w:val="tr-TR"/>
+        </w:rPr>
+        <w:t>🔶</w:t>
+      </w:r>
+      <w:r>
+        <w:rPr>
+          <w:lang w:val="tr-TR"/>
+        </w:rPr>
+        <w:t xml:space="preserve"> İkincil fizik nesneleri (</w:t>
+      </w:r>
+      <w:proofErr w:type="spellStart"/>
+      <w:r>
+        <w:rPr>
+          <w:lang w:val="tr-TR"/>
+        </w:rPr>
+        <w:t>secondary</w:t>
+      </w:r>
+      <w:proofErr w:type="spellEnd"/>
+      <w:r>
+        <w:rPr>
+          <w:lang w:val="tr-TR"/>
+        </w:rPr>
+        <w:t xml:space="preserve"> </w:t>
+      </w:r>
+      <w:proofErr w:type="spellStart"/>
+      <w:r>
+        <w:rPr>
+          <w:lang w:val="tr-TR"/>
+        </w:rPr>
+        <w:t>animation</w:t>
+      </w:r>
+      <w:proofErr w:type="spellEnd"/>
+      <w:r>
+        <w:rPr>
+          <w:lang w:val="tr-TR"/>
+        </w:rPr>
+        <w:t xml:space="preserve">) — kuyruk/kulak/pelerin gibi hedefsiz, saf </w:t>
+      </w:r>
+      <w:proofErr w:type="spellStart"/>
+      <w:r>
+        <w:rPr>
+          <w:lang w:val="tr-TR"/>
+        </w:rPr>
+        <w:t>verlet</w:t>
+      </w:r>
+      <w:proofErr w:type="spellEnd"/>
+      <w:r>
+        <w:rPr>
+          <w:lang w:val="tr-TR"/>
+        </w:rPr>
+        <w:t xml:space="preserve"> + hava direnci (drag) ile sarkan parçalar. </w:t>
+      </w:r>
+      <w:r>
+        <w:rPr>
+          <w:b/>
+          <w:bCs/>
+          <w:lang w:val="tr-TR"/>
+        </w:rPr>
+        <w:t>Başlandı:</w:t>
+      </w:r>
+      <w:r>
+        <w:rPr>
+          <w:lang w:val="tr-TR"/>
+        </w:rPr>
+        <w:t xml:space="preserve"> </w:t>
+      </w:r>
+      <w:proofErr w:type="spellStart"/>
+      <w:r>
+        <w:rPr>
+          <w:lang w:val="tr-TR"/>
+        </w:rPr>
+        <w:t>physics</w:t>
+      </w:r>
+      <w:proofErr w:type="spellEnd"/>
+      <w:r>
+        <w:rPr>
+          <w:lang w:val="tr-TR"/>
+        </w:rPr>
+        <w:t>/</w:t>
+      </w:r>
+      <w:proofErr w:type="spellStart"/>
+      <w:r>
+        <w:rPr>
+          <w:lang w:val="tr-TR"/>
+        </w:rPr>
+        <w:t>verlet.py'ye</w:t>
+      </w:r>
+      <w:proofErr w:type="spellEnd"/>
+      <w:r>
+        <w:rPr>
+          <w:lang w:val="tr-TR"/>
+        </w:rPr>
+        <w:t xml:space="preserve"> </w:t>
+      </w:r>
+      <w:proofErr w:type="spellStart"/>
+      <w:r>
+        <w:rPr>
+          <w:lang w:val="tr-TR"/>
+        </w:rPr>
+        <w:t>wind</w:t>
+      </w:r>
+      <w:proofErr w:type="spellEnd"/>
+      <w:r>
+        <w:rPr>
+          <w:lang w:val="tr-TR"/>
+        </w:rPr>
+        <w:t>/</w:t>
+      </w:r>
+      <w:proofErr w:type="spellStart"/>
+      <w:r>
+        <w:rPr>
+          <w:lang w:val="tr-TR"/>
+        </w:rPr>
+        <w:t>wind_scale</w:t>
+      </w:r>
+      <w:proofErr w:type="spellEnd"/>
+      <w:r>
+        <w:rPr>
+          <w:lang w:val="tr-TR"/>
+        </w:rPr>
+        <w:t xml:space="preserve"> eklendi (</w:t>
+      </w:r>
+      <w:proofErr w:type="spellStart"/>
+      <w:r>
+        <w:rPr>
+          <w:lang w:val="tr-TR"/>
+        </w:rPr>
+        <w:t>gravity</w:t>
+      </w:r>
+      <w:proofErr w:type="spellEnd"/>
+      <w:r>
+        <w:rPr>
+          <w:lang w:val="tr-TR"/>
+        </w:rPr>
+        <w:t xml:space="preserve"> gibi her karede uygulanan, nokta başına ölçeklenen dış ivme) </w:t>
+      </w:r>
+    </w:p>
+    <w:p>
+      <w:pPr>
+        <w:numPr>
+          <w:ilvl w:val="1"/>
+          <w:numId w:val="6"/>
+        </w:numPr>
+        <w:rPr>
+          <w:lang w:val="tr-TR"/>
+        </w:rPr>
+      </w:pPr>
+      <w:r>
+        <w:rPr>
+          <w:lang w:val="tr-TR"/>
+        </w:rPr>
+        <w:t xml:space="preserve">demo/step10_secondary_wind.py: omuzdan sarkan, hiçbir hedefe bağlı olmayan/hiçbir açı kısıtlaması almayan 8 </w:t>
+      </w:r>
+      <w:proofErr w:type="spellStart"/>
+      <w:r>
+        <w:rPr>
+          <w:lang w:val="tr-TR"/>
+        </w:rPr>
+        <w:t>segmentlik</w:t>
+      </w:r>
+      <w:proofErr w:type="spellEnd"/>
+      <w:r>
+        <w:rPr>
+          <w:lang w:val="tr-TR"/>
+        </w:rPr>
+        <w:t xml:space="preserve"> saf bir pelerin. İlk 3sn rüzgarsız (sadece karakterin kendi hareketiyle sallanıyor), sonra 1.5sn'de düzensiz (3 farklı frekansın toplamı) bir </w:t>
+      </w:r>
+      <w:proofErr w:type="spellStart"/>
+      <w:r>
+        <w:rPr>
+          <w:lang w:val="tr-TR"/>
+        </w:rPr>
+        <w:t>gust</w:t>
+      </w:r>
+      <w:proofErr w:type="spellEnd"/>
+      <w:r>
+        <w:rPr>
+          <w:lang w:val="tr-TR"/>
+        </w:rPr>
+        <w:t xml:space="preserve"> rüzgarına geçiyor. </w:t>
+      </w:r>
+      <w:r>
+        <w:rPr>
+          <w:b/>
+          <w:bCs/>
+          <w:lang w:val="tr-TR"/>
+        </w:rPr>
+        <w:t>Ayar dersi:</w:t>
+      </w:r>
+      <w:r>
+        <w:rPr>
+          <w:lang w:val="tr-TR"/>
+        </w:rPr>
+        <w:t xml:space="preserve"> ilk denemede rüzgar yerçekiminden (0.065) çok daha güçlüydü (taban 0.55) ve pelerin </w:t>
+      </w:r>
+      <w:proofErr w:type="spellStart"/>
+      <w:r>
+        <w:rPr>
+          <w:lang w:val="tr-TR"/>
+        </w:rPr>
+        <w:t>gust</w:t>
+      </w:r>
+      <w:proofErr w:type="spellEnd"/>
+      <w:r>
+        <w:rPr>
+          <w:lang w:val="tr-TR"/>
+        </w:rPr>
+        <w:t xml:space="preserve"> dalgalanmasını hiç göstermeden anında dümdüz gerilip kalıyordu; rüzgar yerçekimiyle aynı mertebeye indirilip (taban 0.12) pelerin 5'ten 8 segmente çıkarılınca hem rüzgarsız yürüyüş-ritmi sallanması (uç nokta göreli x: </w:t>
+      </w:r>
+      <w:proofErr w:type="spellStart"/>
+      <w:r>
+        <w:rPr>
+          <w:lang w:val="tr-TR"/>
+        </w:rPr>
+        <w:t>ort.</w:t>
+      </w:r>
+      <w:proofErr w:type="spellEnd"/>
+      <w:r>
+        <w:rPr>
+          <w:lang w:val="tr-TR"/>
+        </w:rPr>
+        <w:t xml:space="preserve"> -81px, </w:t>
+      </w:r>
+      <w:proofErr w:type="spellStart"/>
+      <w:r>
+        <w:rPr>
+          <w:lang w:val="tr-TR"/>
+        </w:rPr>
+        <w:t>std</w:t>
+      </w:r>
+      <w:proofErr w:type="spellEnd"/>
+      <w:r>
+        <w:rPr>
+          <w:lang w:val="tr-TR"/>
+        </w:rPr>
+        <w:t xml:space="preserve"> 30) hem rüzgarlı "bayrak gibi düzleşme" (</w:t>
+      </w:r>
+      <w:proofErr w:type="spellStart"/>
+      <w:r>
+        <w:rPr>
+          <w:lang w:val="tr-TR"/>
+        </w:rPr>
+        <w:t>ort.</w:t>
+      </w:r>
+      <w:proofErr w:type="spellEnd"/>
+      <w:r>
+        <w:rPr>
+          <w:lang w:val="tr-TR"/>
+        </w:rPr>
+        <w:t xml:space="preserve"> -118px, </w:t>
+      </w:r>
+      <w:proofErr w:type="spellStart"/>
+      <w:r>
+        <w:rPr>
+          <w:lang w:val="tr-TR"/>
+        </w:rPr>
+        <w:t>std</w:t>
+      </w:r>
+      <w:proofErr w:type="spellEnd"/>
+      <w:r>
+        <w:rPr>
+          <w:lang w:val="tr-TR"/>
+        </w:rPr>
+        <w:t xml:space="preserve"> 2.5) net şekilde ayırt edilebildi. Sonraki olası genişletme: başka bir ikincil parça (kuyruk/kulak) örneği, karakter durunca sallanmanın devam etmesi.</w:t>
+      </w:r>
+    </w:p>
+    <w:p>
+      <w:pPr>
+        <w:numPr>
+          <w:ilvl w:val="0"/>
+          <w:numId w:val="6"/>
+        </w:numPr>
+        <w:rPr>
+          <w:lang w:val="tr-TR"/>
+        </w:rPr>
+      </w:pPr>
+      <w:r>
+        <w:rPr>
+          <w:rFonts w:ascii="Segoe UI Emoji" w:hAnsi="Segoe UI Emoji" w:cs="Segoe UI Emoji"/>
+          <w:lang w:val="tr-TR"/>
+        </w:rPr>
+        <w:t>⏳</w:t>
+      </w:r>
+      <w:r>
+        <w:rPr>
+          <w:lang w:val="tr-TR"/>
+        </w:rPr>
+        <w:t xml:space="preserve"> Dinamik sürtünme/tutunma — zemine/eyleme göre değişen eklem sürtünmesi (buzda kayma, bir kenara tutunma)</w:t>
+      </w:r>
+    </w:p>
+    <w:p>
+      <w:pPr>
+        <w:numPr>
+          <w:ilvl w:val="0"/>
+          <w:numId w:val="6"/>
+        </w:numPr>
+        <w:rPr>
+          <w:lang w:val="tr-TR"/>
+        </w:rPr>
+      </w:pPr>
+      <w:r>
+        <w:rPr>
+          <w:rFonts w:ascii="Segoe UI Emoji" w:hAnsi="Segoe UI Emoji" w:cs="Segoe UI Emoji"/>
+          <w:lang w:val="tr-TR"/>
+        </w:rPr>
+        <w:t>⏳</w:t>
+      </w:r>
+      <w:r>
+        <w:rPr>
+          <w:lang w:val="tr-TR"/>
+        </w:rPr>
+        <w:t xml:space="preserve"> Kütle merkezi (</w:t>
+      </w:r>
+      <w:proofErr w:type="spellStart"/>
+      <w:r>
+        <w:rPr>
+          <w:lang w:val="tr-TR"/>
+        </w:rPr>
+        <w:t>center</w:t>
+      </w:r>
+      <w:proofErr w:type="spellEnd"/>
+      <w:r>
+        <w:rPr>
+          <w:lang w:val="tr-TR"/>
+        </w:rPr>
+        <w:t xml:space="preserve"> of </w:t>
+      </w:r>
+      <w:proofErr w:type="spellStart"/>
+      <w:r>
+        <w:rPr>
+          <w:lang w:val="tr-TR"/>
+        </w:rPr>
+        <w:t>mass</w:t>
+      </w:r>
+      <w:proofErr w:type="spellEnd"/>
+      <w:r>
+        <w:rPr>
+          <w:lang w:val="tr-TR"/>
+        </w:rPr>
+        <w:t xml:space="preserve">) dengesi — denge kaybında kollarla </w:t>
+      </w:r>
+      <w:proofErr w:type="spellStart"/>
+      <w:r>
+        <w:rPr>
+          <w:lang w:val="tr-TR"/>
+        </w:rPr>
+        <w:t>counter-balance</w:t>
+      </w:r>
+      <w:proofErr w:type="spellEnd"/>
+    </w:p>
+    <w:p>
+      <w:pPr>
+        <w:rPr>
+          <w:lang w:val="tr-TR"/>
+        </w:rPr>
+      </w:pPr>
+      <w:r>
+        <w:rPr>
+          <w:lang w:val="tr-TR"/>
+        </w:rPr>
+        <w:lastRenderedPageBreak/>
+        <w:t xml:space="preserve">7-12 numaralı adımlar kullanıcının </w:t>
+      </w:r>
       <w:proofErr w:type="spellStart"/>
       <w:r>
         <w:rPr>
@@ -965,21 +3231,239 @@
         <w:rPr>
           <w:lang w:val="tr-TR"/>
         </w:rPr>
-        <w:t xml:space="preserve"> World tarzı interaktif </w:t>
-      </w:r>
-      <w:proofErr w:type="gramStart"/>
-      <w:r>
-        <w:rPr>
-          <w:lang w:val="tr-TR"/>
-        </w:rPr>
-        <w:t>hikaye</w:t>
-      </w:r>
-      <w:proofErr w:type="gramEnd"/>
-      <w:r>
-        <w:rPr>
-          <w:lang w:val="tr-TR"/>
-        </w:rPr>
-        <w:t xml:space="preserve"> okuyucu modu</w:t>
+        <w:t xml:space="preserve"> World fizik mimarisi analizinden geliyor (bkz. README "Gelecek yön: organik kütle fiziği" notu) ve modüler olarak eklenecek — </w:t>
+      </w:r>
+      <w:proofErr w:type="spellStart"/>
+      <w:r>
+        <w:rPr>
+          <w:lang w:val="tr-TR"/>
+        </w:rPr>
+        <w:t>örn</w:t>
+      </w:r>
+      <w:proofErr w:type="spellEnd"/>
+      <w:r>
+        <w:rPr>
+          <w:lang w:val="tr-TR"/>
+        </w:rPr>
+        <w:t xml:space="preserve">. önce </w:t>
+      </w:r>
+      <w:proofErr w:type="spellStart"/>
+      <w:r>
+        <w:rPr>
+          <w:lang w:val="tr-TR"/>
+        </w:rPr>
+        <w:t>physics</w:t>
+      </w:r>
+      <w:proofErr w:type="spellEnd"/>
+      <w:r>
+        <w:rPr>
+          <w:lang w:val="tr-TR"/>
+        </w:rPr>
+        <w:t>/</w:t>
+      </w:r>
+      <w:proofErr w:type="spellStart"/>
+      <w:r>
+        <w:rPr>
+          <w:lang w:val="tr-TR"/>
+        </w:rPr>
+        <w:t>verlet.py'ye</w:t>
+      </w:r>
+      <w:proofErr w:type="spellEnd"/>
+      <w:r>
+        <w:rPr>
+          <w:lang w:val="tr-TR"/>
+        </w:rPr>
+        <w:t xml:space="preserve"> hava direnci (drag) eklenip kuyruk/kumaş simülasyonuyla başlanıp, ardından çarpışma/sürtünme katsayılarına geçilmesi planlanıyor.</w:t>
+      </w:r>
+    </w:p>
+    <w:p>
+      <w:pPr>
+        <w:rPr>
+          <w:b/>
+          <w:bCs/>
+          <w:lang w:val="tr-TR"/>
+        </w:rPr>
+      </w:pPr>
+      <w:r>
+        <w:rPr>
+          <w:b/>
+          <w:bCs/>
+          <w:lang w:val="tr-TR"/>
+        </w:rPr>
+        <w:t>Metodoloji notu</w:t>
+      </w:r>
+    </w:p>
+    <w:p>
+      <w:pPr>
+        <w:rPr>
+          <w:lang w:val="tr-TR"/>
+        </w:rPr>
+      </w:pPr>
+      <w:r>
+        <w:rPr>
+          <w:lang w:val="tr-TR"/>
+        </w:rPr>
+        <w:t>Her fizik/</w:t>
+      </w:r>
+      <w:proofErr w:type="spellStart"/>
+      <w:r>
+        <w:rPr>
+          <w:lang w:val="tr-TR"/>
+        </w:rPr>
+        <w:t>gait</w:t>
+      </w:r>
+      <w:proofErr w:type="spellEnd"/>
+      <w:r>
+        <w:rPr>
+          <w:lang w:val="tr-TR"/>
+        </w:rPr>
+        <w:t xml:space="preserve"> değişikliğinden sonra: (1) demoyu yeniden </w:t>
+      </w:r>
+      <w:proofErr w:type="spellStart"/>
+      <w:r>
+        <w:rPr>
+          <w:lang w:val="tr-TR"/>
+        </w:rPr>
+        <w:t>render</w:t>
+      </w:r>
+      <w:proofErr w:type="spellEnd"/>
+      <w:r>
+        <w:rPr>
+          <w:lang w:val="tr-TR"/>
+        </w:rPr>
+        <w:t xml:space="preserve"> et, (2) </w:t>
+      </w:r>
+      <w:proofErr w:type="spellStart"/>
+      <w:r>
+        <w:rPr>
+          <w:lang w:val="tr-TR"/>
+        </w:rPr>
+        <w:t>ffmpeg</w:t>
+      </w:r>
+      <w:proofErr w:type="spellEnd"/>
+      <w:r>
+        <w:rPr>
+          <w:lang w:val="tr-TR"/>
+        </w:rPr>
+        <w:t xml:space="preserve"> ile birden fazla kareyi çıkarıp görsel incele, (3) sayısal bir iddia varsa (</w:t>
+      </w:r>
+      <w:proofErr w:type="spellStart"/>
+      <w:r>
+        <w:rPr>
+          <w:lang w:val="tr-TR"/>
+        </w:rPr>
+        <w:t>jitter</w:t>
+      </w:r>
+      <w:proofErr w:type="spellEnd"/>
+      <w:r>
+        <w:rPr>
+          <w:lang w:val="tr-TR"/>
+        </w:rPr>
+        <w:t xml:space="preserve">, erişilebilirlik, açı varyansı) bunu ölçen bağımsız bir </w:t>
+      </w:r>
+      <w:proofErr w:type="spellStart"/>
+      <w:r>
+        <w:rPr>
+          <w:lang w:val="tr-TR"/>
+        </w:rPr>
+        <w:t>diagnostic</w:t>
+      </w:r>
+      <w:proofErr w:type="spellEnd"/>
+      <w:r>
+        <w:rPr>
+          <w:lang w:val="tr-TR"/>
+        </w:rPr>
+        <w:t xml:space="preserve"> </w:t>
+      </w:r>
+      <w:proofErr w:type="spellStart"/>
+      <w:r>
+        <w:rPr>
+          <w:lang w:val="tr-TR"/>
+        </w:rPr>
+        <w:t>script</w:t>
+      </w:r>
+      <w:proofErr w:type="spellEnd"/>
+      <w:r>
+        <w:rPr>
+          <w:lang w:val="tr-TR"/>
+        </w:rPr>
+        <w:t xml:space="preserve"> yaz, (4) ancak öyle </w:t>
+      </w:r>
+      <w:proofErr w:type="spellStart"/>
+      <w:r>
+        <w:rPr>
+          <w:lang w:val="tr-TR"/>
+        </w:rPr>
+        <w:t>commit</w:t>
+      </w:r>
+      <w:proofErr w:type="spellEnd"/>
+      <w:r>
+        <w:rPr>
+          <w:lang w:val="tr-TR"/>
+        </w:rPr>
+        <w:t xml:space="preserve"> et.</w:t>
+      </w:r>
+    </w:p>
+    <w:p>
+      <w:pPr>
+        <w:rPr>
+          <w:b/>
+          <w:bCs/>
+          <w:lang w:val="tr-TR"/>
+        </w:rPr>
+      </w:pPr>
+      <w:r>
+        <w:rPr>
+          <w:b/>
+          <w:bCs/>
+          <w:lang w:val="tr-TR"/>
+        </w:rPr>
+        <w:t>Ertelenen konular</w:t>
+      </w:r>
+    </w:p>
+    <w:p>
+      <w:pPr>
+        <w:numPr>
+          <w:ilvl w:val="0"/>
+          <w:numId w:val="7"/>
+        </w:numPr>
+        <w:rPr>
+          <w:lang w:val="tr-TR"/>
+        </w:rPr>
+      </w:pPr>
+      <w:r>
+        <w:rPr>
+          <w:lang w:val="tr-TR"/>
+        </w:rPr>
+        <w:t xml:space="preserve">Kalçaya </w:t>
+      </w:r>
+      <w:proofErr w:type="spellStart"/>
+      <w:r>
+        <w:rPr>
+          <w:lang w:val="tr-TR"/>
+        </w:rPr>
+        <w:t>gait</w:t>
+      </w:r>
+      <w:proofErr w:type="spellEnd"/>
+      <w:r>
+        <w:rPr>
+          <w:lang w:val="tr-TR"/>
+        </w:rPr>
+        <w:t>-fazına bağlı dikey "</w:t>
+      </w:r>
+      <w:proofErr w:type="spellStart"/>
+      <w:r>
+        <w:rPr>
+          <w:lang w:val="tr-TR"/>
+        </w:rPr>
+        <w:t>bob</w:t>
+      </w:r>
+      <w:proofErr w:type="spellEnd"/>
+      <w:r>
+        <w:rPr>
+          <w:lang w:val="tr-TR"/>
+        </w:rPr>
+        <w:t>" eklenmesi (hipotez: bu da "robotik/kayıyor" hissine katkıda bulunuyor olabilir, ama birincil erişilebilirlik düzeltmesi yeterli olursa gerekmeyebilir — henüz karar verilmedi, kullanıcı geri bildirimine bağlı)</w:t>
       </w:r>
     </w:p>
     <w:p/>
@@ -1294,6 +3778,123 @@
     </w:lvl>
   </w:abstractNum>
   <w:abstractNum w:abstractNumId="2" w15:restartNumberingAfterBreak="0">
+    <w:nsid w:val="2385703A"/>
+    <w:multiLevelType w:val="multilevel"/>
+    <w:tmpl w:val="83F82CE6"/>
+    <w:lvl w:ilvl="0">
+      <w:start w:val="1"/>
+      <w:numFmt w:val="decimal"/>
+      <w:lvlText w:val="%1."/>
+      <w:lvlJc w:val="left"/>
+      <w:pPr>
+        <w:tabs>
+          <w:tab w:val="num" w:pos="720"/>
+        </w:tabs>
+        <w:ind w:left="720" w:hanging="360"/>
+      </w:pPr>
+    </w:lvl>
+    <w:lvl w:ilvl="1">
+      <w:start w:val="1"/>
+      <w:numFmt w:val="bullet"/>
+      <w:lvlText w:val="o"/>
+      <w:lvlJc w:val="left"/>
+      <w:pPr>
+        <w:tabs>
+          <w:tab w:val="num" w:pos="1440"/>
+        </w:tabs>
+        <w:ind w:left="1440" w:hanging="360"/>
+      </w:pPr>
+      <w:rPr>
+        <w:rFonts w:ascii="Courier New" w:hAnsi="Courier New" w:hint="default"/>
+        <w:sz w:val="20"/>
+      </w:rPr>
+    </w:lvl>
+    <w:lvl w:ilvl="2" w:tentative="1">
+      <w:start w:val="1"/>
+      <w:numFmt w:val="decimal"/>
+      <w:lvlText w:val="%3."/>
+      <w:lvlJc w:val="left"/>
+      <w:pPr>
+        <w:tabs>
+          <w:tab w:val="num" w:pos="2160"/>
+        </w:tabs>
+        <w:ind w:left="2160" w:hanging="360"/>
+      </w:pPr>
+    </w:lvl>
+    <w:lvl w:ilvl="3" w:tentative="1">
+      <w:start w:val="1"/>
+      <w:numFmt w:val="decimal"/>
+      <w:lvlText w:val="%4."/>
+      <w:lvlJc w:val="left"/>
+      <w:pPr>
+        <w:tabs>
+          <w:tab w:val="num" w:pos="2880"/>
+        </w:tabs>
+        <w:ind w:left="2880" w:hanging="360"/>
+      </w:pPr>
+    </w:lvl>
+    <w:lvl w:ilvl="4" w:tentative="1">
+      <w:start w:val="1"/>
+      <w:numFmt w:val="decimal"/>
+      <w:lvlText w:val="%5."/>
+      <w:lvlJc w:val="left"/>
+      <w:pPr>
+        <w:tabs>
+          <w:tab w:val="num" w:pos="3600"/>
+        </w:tabs>
+        <w:ind w:left="3600" w:hanging="360"/>
+      </w:pPr>
+    </w:lvl>
+    <w:lvl w:ilvl="5" w:tentative="1">
+      <w:start w:val="1"/>
+      <w:numFmt w:val="decimal"/>
+      <w:lvlText w:val="%6."/>
+      <w:lvlJc w:val="left"/>
+      <w:pPr>
+        <w:tabs>
+          <w:tab w:val="num" w:pos="4320"/>
+        </w:tabs>
+        <w:ind w:left="4320" w:hanging="360"/>
+      </w:pPr>
+    </w:lvl>
+    <w:lvl w:ilvl="6" w:tentative="1">
+      <w:start w:val="1"/>
+      <w:numFmt w:val="decimal"/>
+      <w:lvlText w:val="%7."/>
+      <w:lvlJc w:val="left"/>
+      <w:pPr>
+        <w:tabs>
+          <w:tab w:val="num" w:pos="5040"/>
+        </w:tabs>
+        <w:ind w:left="5040" w:hanging="360"/>
+      </w:pPr>
+    </w:lvl>
+    <w:lvl w:ilvl="7" w:tentative="1">
+      <w:start w:val="1"/>
+      <w:numFmt w:val="decimal"/>
+      <w:lvlText w:val="%8."/>
+      <w:lvlJc w:val="left"/>
+      <w:pPr>
+        <w:tabs>
+          <w:tab w:val="num" w:pos="5760"/>
+        </w:tabs>
+        <w:ind w:left="5760" w:hanging="360"/>
+      </w:pPr>
+    </w:lvl>
+    <w:lvl w:ilvl="8" w:tentative="1">
+      <w:start w:val="1"/>
+      <w:numFmt w:val="decimal"/>
+      <w:lvlText w:val="%9."/>
+      <w:lvlJc w:val="left"/>
+      <w:pPr>
+        <w:tabs>
+          <w:tab w:val="num" w:pos="6480"/>
+        </w:tabs>
+        <w:ind w:left="6480" w:hanging="360"/>
+      </w:pPr>
+    </w:lvl>
+  </w:abstractNum>
+  <w:abstractNum w:abstractNumId="3" w15:restartNumberingAfterBreak="0">
     <w:nsid w:val="4CDA0D45"/>
     <w:multiLevelType w:val="multilevel"/>
     <w:tmpl w:val="65607C98"/>
@@ -1406,7 +4007,7 @@
       </w:pPr>
     </w:lvl>
   </w:abstractNum>
-  <w:abstractNum w:abstractNumId="3" w15:restartNumberingAfterBreak="0">
+  <w:abstractNum w:abstractNumId="4" w15:restartNumberingAfterBreak="0">
     <w:nsid w:val="4F27452E"/>
     <w:multiLevelType w:val="multilevel"/>
     <w:tmpl w:val="9304AF10"/>
@@ -1555,7 +4156,7 @@
       </w:rPr>
     </w:lvl>
   </w:abstractNum>
-  <w:abstractNum w:abstractNumId="4" w15:restartNumberingAfterBreak="0">
+  <w:abstractNum w:abstractNumId="5" w15:restartNumberingAfterBreak="0">
     <w:nsid w:val="5426709F"/>
     <w:multiLevelType w:val="multilevel"/>
     <w:tmpl w:val="B09CE54E"/>
@@ -1704,20 +4305,175 @@
       </w:rPr>
     </w:lvl>
   </w:abstractNum>
+  <w:abstractNum w:abstractNumId="6" w15:restartNumberingAfterBreak="0">
+    <w:nsid w:val="7F984304"/>
+    <w:multiLevelType w:val="multilevel"/>
+    <w:tmpl w:val="82F430D6"/>
+    <w:lvl w:ilvl="0">
+      <w:start w:val="1"/>
+      <w:numFmt w:val="bullet"/>
+      <w:lvlText w:val=""/>
+      <w:lvlJc w:val="left"/>
+      <w:pPr>
+        <w:tabs>
+          <w:tab w:val="num" w:pos="720"/>
+        </w:tabs>
+        <w:ind w:left="720" w:hanging="360"/>
+      </w:pPr>
+      <w:rPr>
+        <w:rFonts w:ascii="Symbol" w:hAnsi="Symbol" w:hint="default"/>
+        <w:sz w:val="20"/>
+      </w:rPr>
+    </w:lvl>
+    <w:lvl w:ilvl="1" w:tentative="1">
+      <w:start w:val="1"/>
+      <w:numFmt w:val="bullet"/>
+      <w:lvlText w:val="o"/>
+      <w:lvlJc w:val="left"/>
+      <w:pPr>
+        <w:tabs>
+          <w:tab w:val="num" w:pos="1440"/>
+        </w:tabs>
+        <w:ind w:left="1440" w:hanging="360"/>
+      </w:pPr>
+      <w:rPr>
+        <w:rFonts w:ascii="Courier New" w:hAnsi="Courier New" w:hint="default"/>
+        <w:sz w:val="20"/>
+      </w:rPr>
+    </w:lvl>
+    <w:lvl w:ilvl="2" w:tentative="1">
+      <w:start w:val="1"/>
+      <w:numFmt w:val="bullet"/>
+      <w:lvlText w:val=""/>
+      <w:lvlJc w:val="left"/>
+      <w:pPr>
+        <w:tabs>
+          <w:tab w:val="num" w:pos="2160"/>
+        </w:tabs>
+        <w:ind w:left="2160" w:hanging="360"/>
+      </w:pPr>
+      <w:rPr>
+        <w:rFonts w:ascii="Wingdings" w:hAnsi="Wingdings" w:hint="default"/>
+        <w:sz w:val="20"/>
+      </w:rPr>
+    </w:lvl>
+    <w:lvl w:ilvl="3" w:tentative="1">
+      <w:start w:val="1"/>
+      <w:numFmt w:val="bullet"/>
+      <w:lvlText w:val=""/>
+      <w:lvlJc w:val="left"/>
+      <w:pPr>
+        <w:tabs>
+          <w:tab w:val="num" w:pos="2880"/>
+        </w:tabs>
+        <w:ind w:left="2880" w:hanging="360"/>
+      </w:pPr>
+      <w:rPr>
+        <w:rFonts w:ascii="Wingdings" w:hAnsi="Wingdings" w:hint="default"/>
+        <w:sz w:val="20"/>
+      </w:rPr>
+    </w:lvl>
+    <w:lvl w:ilvl="4" w:tentative="1">
+      <w:start w:val="1"/>
+      <w:numFmt w:val="bullet"/>
+      <w:lvlText w:val=""/>
+      <w:lvlJc w:val="left"/>
+      <w:pPr>
+        <w:tabs>
+          <w:tab w:val="num" w:pos="3600"/>
+        </w:tabs>
+        <w:ind w:left="3600" w:hanging="360"/>
+      </w:pPr>
+      <w:rPr>
+        <w:rFonts w:ascii="Wingdings" w:hAnsi="Wingdings" w:hint="default"/>
+        <w:sz w:val="20"/>
+      </w:rPr>
+    </w:lvl>
+    <w:lvl w:ilvl="5" w:tentative="1">
+      <w:start w:val="1"/>
+      <w:numFmt w:val="bullet"/>
+      <w:lvlText w:val=""/>
+      <w:lvlJc w:val="left"/>
+      <w:pPr>
+        <w:tabs>
+          <w:tab w:val="num" w:pos="4320"/>
+        </w:tabs>
+        <w:ind w:left="4320" w:hanging="360"/>
+      </w:pPr>
+      <w:rPr>
+        <w:rFonts w:ascii="Wingdings" w:hAnsi="Wingdings" w:hint="default"/>
+        <w:sz w:val="20"/>
+      </w:rPr>
+    </w:lvl>
+    <w:lvl w:ilvl="6" w:tentative="1">
+      <w:start w:val="1"/>
+      <w:numFmt w:val="bullet"/>
+      <w:lvlText w:val=""/>
+      <w:lvlJc w:val="left"/>
+      <w:pPr>
+        <w:tabs>
+          <w:tab w:val="num" w:pos="5040"/>
+        </w:tabs>
+        <w:ind w:left="5040" w:hanging="360"/>
+      </w:pPr>
+      <w:rPr>
+        <w:rFonts w:ascii="Wingdings" w:hAnsi="Wingdings" w:hint="default"/>
+        <w:sz w:val="20"/>
+      </w:rPr>
+    </w:lvl>
+    <w:lvl w:ilvl="7" w:tentative="1">
+      <w:start w:val="1"/>
+      <w:numFmt w:val="bullet"/>
+      <w:lvlText w:val=""/>
+      <w:lvlJc w:val="left"/>
+      <w:pPr>
+        <w:tabs>
+          <w:tab w:val="num" w:pos="5760"/>
+        </w:tabs>
+        <w:ind w:left="5760" w:hanging="360"/>
+      </w:pPr>
+      <w:rPr>
+        <w:rFonts w:ascii="Wingdings" w:hAnsi="Wingdings" w:hint="default"/>
+        <w:sz w:val="20"/>
+      </w:rPr>
+    </w:lvl>
+    <w:lvl w:ilvl="8" w:tentative="1">
+      <w:start w:val="1"/>
+      <w:numFmt w:val="bullet"/>
+      <w:lvlText w:val=""/>
+      <w:lvlJc w:val="left"/>
+      <w:pPr>
+        <w:tabs>
+          <w:tab w:val="num" w:pos="6480"/>
+        </w:tabs>
+        <w:ind w:left="6480" w:hanging="360"/>
+      </w:pPr>
+      <w:rPr>
+        <w:rFonts w:ascii="Wingdings" w:hAnsi="Wingdings" w:hint="default"/>
+        <w:sz w:val="20"/>
+      </w:rPr>
+    </w:lvl>
+  </w:abstractNum>
   <w:num w:numId="1" w16cid:durableId="871655062">
-    <w:abstractNumId w:val="3"/>
+    <w:abstractNumId w:val="4"/>
   </w:num>
   <w:num w:numId="2" w16cid:durableId="784039198">
-    <w:abstractNumId w:val="4"/>
+    <w:abstractNumId w:val="5"/>
   </w:num>
   <w:num w:numId="3" w16cid:durableId="477309907">
-    <w:abstractNumId w:val="2"/>
+    <w:abstractNumId w:val="3"/>
   </w:num>
   <w:num w:numId="4" w16cid:durableId="1744598687">
     <w:abstractNumId w:val="1"/>
   </w:num>
   <w:num w:numId="5" w16cid:durableId="507137220">
     <w:abstractNumId w:val="0"/>
+  </w:num>
+  <w:num w:numId="6" w16cid:durableId="1570386079">
+    <w:abstractNumId w:val="2"/>
+  </w:num>
+  <w:num w:numId="7" w16cid:durableId="1673219594">
+    <w:abstractNumId w:val="6"/>
   </w:num>
 </w:numbering>
 </file>
@@ -2652,6 +5408,29 @@
       <w:spacing w:val="5"/>
     </w:rPr>
   </w:style>
+  <w:style w:type="character" w:styleId="Kpr">
+    <w:name w:val="Hyperlink"/>
+    <w:basedOn w:val="VarsaylanParagrafYazTipi"/>
+    <w:uiPriority w:val="99"/>
+    <w:unhideWhenUsed/>
+    <w:rsid w:val="0005358E"/>
+    <w:rPr>
+      <w:color w:val="467886" w:themeColor="hyperlink"/>
+      <w:u w:val="single"/>
+    </w:rPr>
+  </w:style>
+  <w:style w:type="character" w:styleId="zmlenmeyenBahsetme">
+    <w:name w:val="Unresolved Mention"/>
+    <w:basedOn w:val="VarsaylanParagrafYazTipi"/>
+    <w:uiPriority w:val="99"/>
+    <w:semiHidden/>
+    <w:unhideWhenUsed/>
+    <w:rsid w:val="0005358E"/>
+    <w:rPr>
+      <w:color w:val="605E5C"/>
+      <w:shd w:val="clear" w:color="auto" w:fill="E1DFDD"/>
+    </w:rPr>
+  </w:style>
 </w:styles>
 </file>
 

</xml_diff>